<commit_message>
Update ESG indices, XGBoost, and Dynamic Panel results using real World Bank country-level data
</commit_message>
<xml_diff>
--- a/sustainability_academic_report.docx
+++ b/sustainability_academic_report.docx
@@ -12,9 +12,9 @@
           <w:b/>
           <w:sz w:val="28"/>
         </w:rPr>
-        <w:t>BİST ŞİRKETLERİNDE SÜRDÜRÜLEBİLİRLİK AÇIKLAMALARI VE GREENWASHING RİSKİNİN MODELLENMESİ:</w:t>
+        <w:t>DÜNYA BANKASI VERİLERİYLE ÜLKE ESG ENDEKSLERİNİN CO2 EMİSYONLARI ÜZERİNDEKİ ETKİSİ:</w:t>
         <w:br/>
-        <w:t>PCA, XGBOOST VE DİNAMİK PANEL VERİ ANALİZİ</w:t>
+        <w:t>PCA, XGBOOST VE DİNAMİK PANEL REGRESYON MODELLERİ</w:t>
       </w:r>
     </w:p>
     <w:p>
@@ -31,7 +31,7 @@
           <w:i/>
           <w:sz w:val="22"/>
         </w:rPr>
-        <w:t>Araştırma Raporu &amp; Model Bulguları</w:t>
+        <w:t>Araştırma Raporu &amp; Ülke Düzeyinde Model Bulguları</w:t>
         <w:br/>
         <w:t>Tarih: 19 Haziran 2026</w:t>
       </w:r>
@@ -51,7 +51,7 @@
     </w:p>
     <w:p>
       <w:r>
-        <w:t>Bu çalışmada, Borsa İstanbul (BIST) bünyesindeki 20 pilot şirketin 2020-2024 dönemine ait sürdürülebilirlik raporlarındaki çevresel (E), sosyal (S), yönetişim (G) göstergeleri ile yapay zekâ tabanlı metinsel kalıplar kullanılarak Greenwashing Risk Skoru (GRS) oluşturulmuş ve modellenmiştir. Gösterge ağırlıkları Temel Bileşenler Analizi (PCA) ile objektif olarak belirlenmiş; bu ağırlıklar kullanılarak E, S, G ve Metin endeksleri türetilmiştir. Greenwashing riskini etkileyen unsurlar XGBoost makine öğrenmesi ve SHAP değerleriyle açıklanmıştır. Şirketlerin zaman içindeki davranışsal tutarlılığını modellemek adına dinamik panel veri analizleri yürütülmüştür. Bulgular, sürdürülebilirlik açıklamalarının kalitesini artıran ve risk skorunu düşüren en önemli bileşenlerin metinsel kanıt kalitesi (TEXTIndex) ve çevresel açıklamaların kapsamı (ENVIndex) olduğunu ortaya koymaktadır.</w:t>
+        <w:t>Bu çalışmada, Dünya Bankası Dünya Gelişme Göstergeleri (WDI) veri setinde yer alan Çevre, Sosyal ve Yönetişim (ESG) göstergeleri kullanılarak 20 ülke için 2010-2023 dönemine ait ülke düzeyinde endeksler oluşturulmuştur. Çevresel, sosyal ve kurumsal/makro yönetişim boyutlarındaki göstergelerin ağırlıkları Temel Bileşenler Analizi (PCA) ile belirlenmiş; elde edilen ENVIndex, SOCIndex ve GOVIndex ülke karbon emisyonları (`CO2_per_capita`) üzerindeki etkisini incelemek üzere modellenmiştir. Modellemede doğrusal olmayan ilişkileri yakalamak amacıyla XGBoost makine öğrenmesi ve marjinal etkileri açıklayan SHAP değerleri kullanılmıştır. Davranışsal ataleti ve sabit etkileri kontrol etmek adına ise dinamik panel regresyon modelleri (Fixed Effects) çalıştırılmıştır. Bulgular, sürdürülebilirlik boyutlarındaki (özellikle SOCIndex ve ENVIndex) iyileşmenin karbon emisyonlarını düşürdüğünü, buna karşılık ekonomik büyüme ve büyüklüğün (GDP pc) emisyonlar üzerinde artırıcı yönde baskı oluşturduğunu ortaya koymaktadır.</w:t>
       </w:r>
     </w:p>
     <w:p>
@@ -64,7 +64,7 @@
     </w:p>
     <w:p>
       <w:r>
-        <w:t>Veri seti 20 şirketin 5 yıllık (N=20, T=5, Toplam 100 gözlem) panel veri yapısından oluşmaktadır. Ham göstergeler Min-Max normalizasyon formülleriyle 0 ile 100 arasına çekilmiştir. Boyut endeksleri, normalize edilmiş alt değişkenlerin ilk temel bileşen (PC1) yük değerleriyle ağırlıklandırılması sonucu hesaplanmıştır. Greenwashing Risk Skoru (GRS), raporlardaki belirsiz ifade oranları, sayısal kanıt düzeyleri, kanıt destekli iddia oranı ve standart (GRI/TCFD) uyum skorlarının ağırlıklı ters toplamıyla elde edilmiştir.</w:t>
+        <w:t>Veri seti Dünya Bankası API'sinden çekilen 20 ülke ve 14 yılı kapsayan dengeli panel veri yapısından (N=20, T=14, Toplam 280 gözlem) oluşmaktadır. Ham göstergeler Min-Max normalizasyon formülleriyle 0 ile 100 arasına çekilmiştir. Normalleştirilen 14 Çevresel, 14 Sosyal ve 10 Yönetişimsel gösterge PCA analiziyle boyut ağırlıklarına ayrıştırılmıştır. Bağımlı değişken kişi başına karbon emisyonudur (`CO2_per_capita`).</w:t>
       </w:r>
     </w:p>
     <w:p>
@@ -77,7 +77,7 @@
     </w:p>
     <w:p>
       <w:r>
-        <w:t>Modelde yer alan temel endeksler ve finansal kontrol değişkenlerine ait tanımlayıcı istatistikler Tablo 1'de özetlenmiştir.</w:t>
+        <w:t>Modelde yer alan temel endeksler ve makro kontrol değişkenlerine ait tanımlayıcı istatistikler Tablo 1'de sunulmaktadır.</w:t>
       </w:r>
     </w:p>
     <w:tbl>
@@ -94,20 +94,19 @@
         </w:tblBorders>
       </w:tblPr>
       <w:tblGrid>
-        <w:gridCol w:w="960"/>
-        <w:gridCol w:w="960"/>
-        <w:gridCol w:w="960"/>
-        <w:gridCol w:w="960"/>
-        <w:gridCol w:w="960"/>
-        <w:gridCol w:w="960"/>
-        <w:gridCol w:w="960"/>
-        <w:gridCol w:w="960"/>
-        <w:gridCol w:w="960"/>
+        <w:gridCol w:w="1080"/>
+        <w:gridCol w:w="1080"/>
+        <w:gridCol w:w="1080"/>
+        <w:gridCol w:w="1080"/>
+        <w:gridCol w:w="1080"/>
+        <w:gridCol w:w="1080"/>
+        <w:gridCol w:w="1080"/>
+        <w:gridCol w:w="1080"/>
       </w:tblGrid>
       <w:tr>
         <w:tc>
           <w:tcPr>
-            <w:tcW w:type="dxa" w:w="960"/>
+            <w:tcW w:type="dxa" w:w="1080"/>
             <w:shd w:fill="F2F2F2"/>
           </w:tcPr>
           <w:p>
@@ -128,7 +127,7 @@
         </w:tc>
         <w:tc>
           <w:tcPr>
-            <w:tcW w:type="dxa" w:w="960"/>
+            <w:tcW w:type="dxa" w:w="1080"/>
             <w:shd w:fill="F2F2F2"/>
           </w:tcPr>
           <w:p>
@@ -143,13 +142,13 @@
                 <w:color w:val="000000"/>
                 <w:sz w:val="18"/>
               </w:rPr>
-              <w:t>Greenwashing Risk</w:t>
+              <w:t>CO2 per Capita</w:t>
             </w:r>
           </w:p>
         </w:tc>
         <w:tc>
           <w:tcPr>
-            <w:tcW w:type="dxa" w:w="960"/>
+            <w:tcW w:type="dxa" w:w="1080"/>
             <w:shd w:fill="F2F2F2"/>
           </w:tcPr>
           <w:p>
@@ -170,7 +169,7 @@
         </w:tc>
         <w:tc>
           <w:tcPr>
-            <w:tcW w:type="dxa" w:w="960"/>
+            <w:tcW w:type="dxa" w:w="1080"/>
             <w:shd w:fill="F2F2F2"/>
           </w:tcPr>
           <w:p>
@@ -191,7 +190,7 @@
         </w:tc>
         <w:tc>
           <w:tcPr>
-            <w:tcW w:type="dxa" w:w="960"/>
+            <w:tcW w:type="dxa" w:w="1080"/>
             <w:shd w:fill="F2F2F2"/>
           </w:tcPr>
           <w:p>
@@ -212,7 +211,7 @@
         </w:tc>
         <w:tc>
           <w:tcPr>
-            <w:tcW w:type="dxa" w:w="960"/>
+            <w:tcW w:type="dxa" w:w="1080"/>
             <w:shd w:fill="F2F2F2"/>
           </w:tcPr>
           <w:p>
@@ -227,13 +226,13 @@
                 <w:color w:val="000000"/>
                 <w:sz w:val="18"/>
               </w:rPr>
-              <w:t>TEXTIndex</w:t>
+              <w:t>Log GDP pc</w:t>
             </w:r>
           </w:p>
         </w:tc>
         <w:tc>
           <w:tcPr>
-            <w:tcW w:type="dxa" w:w="960"/>
+            <w:tcW w:type="dxa" w:w="1080"/>
             <w:shd w:fill="F2F2F2"/>
           </w:tcPr>
           <w:p>
@@ -248,13 +247,13 @@
                 <w:color w:val="000000"/>
                 <w:sz w:val="18"/>
               </w:rPr>
-              <w:t>Firm Size</w:t>
+              <w:t>GDP Büyüme</w:t>
             </w:r>
           </w:p>
         </w:tc>
         <w:tc>
           <w:tcPr>
-            <w:tcW w:type="dxa" w:w="960"/>
+            <w:tcW w:type="dxa" w:w="1080"/>
             <w:shd w:fill="F2F2F2"/>
           </w:tcPr>
           <w:p>
@@ -269,28 +268,7 @@
                 <w:color w:val="000000"/>
                 <w:sz w:val="18"/>
               </w:rPr>
-              <w:t>ROA</w:t>
-            </w:r>
-          </w:p>
-        </w:tc>
-        <w:tc>
-          <w:tcPr>
-            <w:tcW w:type="dxa" w:w="960"/>
-            <w:shd w:fill="F2F2F2"/>
-          </w:tcPr>
-          <w:p>
-            <w:pPr>
-              <w:jc w:val="center"/>
-            </w:pPr>
-            <w:r>
-              <w:rPr>
-                <w:rFonts w:ascii="Calibri" w:hAnsi="Calibri"/>
-                <w:b/>
-                <w:i w:val="0"/>
-                <w:color w:val="000000"/>
-                <w:sz w:val="18"/>
-              </w:rPr>
-              <w:t>Leverage</w:t>
+              <w:t>Enflasyon</w:t>
             </w:r>
           </w:p>
         </w:tc>
@@ -298,7 +276,7 @@
       <w:tr>
         <w:tc>
           <w:tcPr>
-            <w:tcW w:type="dxa" w:w="960"/>
+            <w:tcW w:type="dxa" w:w="1080"/>
           </w:tcPr>
           <w:p>
             <w:pPr>
@@ -318,7 +296,7 @@
         </w:tc>
         <w:tc>
           <w:tcPr>
-            <w:tcW w:type="dxa" w:w="960"/>
+            <w:tcW w:type="dxa" w:w="1080"/>
           </w:tcPr>
           <w:p>
             <w:pPr>
@@ -332,13 +310,13 @@
                 <w:color w:val="000000"/>
                 <w:sz w:val="18"/>
               </w:rPr>
-              <w:t>46.756</w:t>
+              <w:t>7.870</w:t>
             </w:r>
           </w:p>
         </w:tc>
         <w:tc>
           <w:tcPr>
-            <w:tcW w:type="dxa" w:w="960"/>
+            <w:tcW w:type="dxa" w:w="1080"/>
           </w:tcPr>
           <w:p>
             <w:pPr>
@@ -352,13 +330,13 @@
                 <w:color w:val="000000"/>
                 <w:sz w:val="18"/>
               </w:rPr>
-              <w:t>55.372</w:t>
+              <w:t>72.719</w:t>
             </w:r>
           </w:p>
         </w:tc>
         <w:tc>
           <w:tcPr>
-            <w:tcW w:type="dxa" w:w="960"/>
+            <w:tcW w:type="dxa" w:w="1080"/>
           </w:tcPr>
           <w:p>
             <w:pPr>
@@ -372,13 +350,13 @@
                 <w:color w:val="000000"/>
                 <w:sz w:val="18"/>
               </w:rPr>
-              <w:t>53.775</w:t>
+              <w:t>70.583</w:t>
             </w:r>
           </w:p>
         </w:tc>
         <w:tc>
           <w:tcPr>
-            <w:tcW w:type="dxa" w:w="960"/>
+            <w:tcW w:type="dxa" w:w="1080"/>
           </w:tcPr>
           <w:p>
             <w:pPr>
@@ -392,13 +370,13 @@
                 <w:color w:val="000000"/>
                 <w:sz w:val="18"/>
               </w:rPr>
-              <w:t>60.549</w:t>
+              <w:t>55.197</w:t>
             </w:r>
           </w:p>
         </w:tc>
         <w:tc>
           <w:tcPr>
-            <w:tcW w:type="dxa" w:w="960"/>
+            <w:tcW w:type="dxa" w:w="1080"/>
           </w:tcPr>
           <w:p>
             <w:pPr>
@@ -412,13 +390,13 @@
                 <w:color w:val="000000"/>
                 <w:sz w:val="18"/>
               </w:rPr>
-              <w:t>59.898</w:t>
+              <w:t>10.145</w:t>
             </w:r>
           </w:p>
         </w:tc>
         <w:tc>
           <w:tcPr>
-            <w:tcW w:type="dxa" w:w="960"/>
+            <w:tcW w:type="dxa" w:w="1080"/>
           </w:tcPr>
           <w:p>
             <w:pPr>
@@ -432,13 +410,13 @@
                 <w:color w:val="000000"/>
                 <w:sz w:val="18"/>
               </w:rPr>
-              <w:t>11.684</w:t>
+              <w:t>2.408</w:t>
             </w:r>
           </w:p>
         </w:tc>
         <w:tc>
           <w:tcPr>
-            <w:tcW w:type="dxa" w:w="960"/>
+            <w:tcW w:type="dxa" w:w="1080"/>
           </w:tcPr>
           <w:p>
             <w:pPr>
@@ -452,27 +430,7 @@
                 <w:color w:val="000000"/>
                 <w:sz w:val="18"/>
               </w:rPr>
-              <w:t>6.066</w:t>
-            </w:r>
-          </w:p>
-        </w:tc>
-        <w:tc>
-          <w:tcPr>
-            <w:tcW w:type="dxa" w:w="960"/>
-          </w:tcPr>
-          <w:p>
-            <w:pPr>
-              <w:jc w:val="right"/>
-            </w:pPr>
-            <w:r>
-              <w:rPr>
-                <w:rFonts w:ascii="Calibri" w:hAnsi="Calibri"/>
-                <w:b w:val="0"/>
-                <w:i w:val="0"/>
-                <w:color w:val="000000"/>
-                <w:sz w:val="18"/>
-              </w:rPr>
-              <w:t>50.466</w:t>
+              <w:t>3.555</w:t>
             </w:r>
           </w:p>
         </w:tc>
@@ -480,7 +438,7 @@
       <w:tr>
         <w:tc>
           <w:tcPr>
-            <w:tcW w:type="dxa" w:w="960"/>
+            <w:tcW w:type="dxa" w:w="1080"/>
           </w:tcPr>
           <w:p>
             <w:pPr>
@@ -500,7 +458,7 @@
         </w:tc>
         <w:tc>
           <w:tcPr>
-            <w:tcW w:type="dxa" w:w="960"/>
+            <w:tcW w:type="dxa" w:w="1080"/>
           </w:tcPr>
           <w:p>
             <w:pPr>
@@ -514,13 +472,13 @@
                 <w:color w:val="000000"/>
                 <w:sz w:val="18"/>
               </w:rPr>
-              <w:t>13.700</w:t>
+              <w:t>4.320</w:t>
             </w:r>
           </w:p>
         </w:tc>
         <w:tc>
           <w:tcPr>
-            <w:tcW w:type="dxa" w:w="960"/>
+            <w:tcW w:type="dxa" w:w="1080"/>
           </w:tcPr>
           <w:p>
             <w:pPr>
@@ -534,13 +492,13 @@
                 <w:color w:val="000000"/>
                 <w:sz w:val="18"/>
               </w:rPr>
-              <w:t>10.490</w:t>
+              <w:t>14.247</w:t>
             </w:r>
           </w:p>
         </w:tc>
         <w:tc>
           <w:tcPr>
-            <w:tcW w:type="dxa" w:w="960"/>
+            <w:tcW w:type="dxa" w:w="1080"/>
           </w:tcPr>
           <w:p>
             <w:pPr>
@@ -554,13 +512,13 @@
                 <w:color w:val="000000"/>
                 <w:sz w:val="18"/>
               </w:rPr>
-              <w:t>19.117</w:t>
+              <w:t>15.613</w:t>
             </w:r>
           </w:p>
         </w:tc>
         <w:tc>
           <w:tcPr>
-            <w:tcW w:type="dxa" w:w="960"/>
+            <w:tcW w:type="dxa" w:w="1080"/>
           </w:tcPr>
           <w:p>
             <w:pPr>
@@ -574,13 +532,13 @@
                 <w:color w:val="000000"/>
                 <w:sz w:val="18"/>
               </w:rPr>
-              <w:t>22.974</w:t>
+              <w:t>9.845</w:t>
             </w:r>
           </w:p>
         </w:tc>
         <w:tc>
           <w:tcPr>
-            <w:tcW w:type="dxa" w:w="960"/>
+            <w:tcW w:type="dxa" w:w="1080"/>
           </w:tcPr>
           <w:p>
             <w:pPr>
@@ -594,13 +552,13 @@
                 <w:color w:val="000000"/>
                 <w:sz w:val="18"/>
               </w:rPr>
-              <w:t>8.586</w:t>
+              <w:t>0.989</w:t>
             </w:r>
           </w:p>
         </w:tc>
         <w:tc>
           <w:tcPr>
-            <w:tcW w:type="dxa" w:w="960"/>
+            <w:tcW w:type="dxa" w:w="1080"/>
           </w:tcPr>
           <w:p>
             <w:pPr>
@@ -614,13 +572,13 @@
                 <w:color w:val="000000"/>
                 <w:sz w:val="18"/>
               </w:rPr>
-              <w:t>0.982</w:t>
+              <w:t>3.191</w:t>
             </w:r>
           </w:p>
         </w:tc>
         <w:tc>
           <w:tcPr>
-            <w:tcW w:type="dxa" w:w="960"/>
+            <w:tcW w:type="dxa" w:w="1080"/>
           </w:tcPr>
           <w:p>
             <w:pPr>
@@ -634,27 +592,7 @@
                 <w:color w:val="000000"/>
                 <w:sz w:val="18"/>
               </w:rPr>
-              <w:t>2.515</w:t>
-            </w:r>
-          </w:p>
-        </w:tc>
-        <w:tc>
-          <w:tcPr>
-            <w:tcW w:type="dxa" w:w="960"/>
-          </w:tcPr>
-          <w:p>
-            <w:pPr>
-              <w:jc w:val="right"/>
-            </w:pPr>
-            <w:r>
-              <w:rPr>
-                <w:rFonts w:ascii="Calibri" w:hAnsi="Calibri"/>
-                <w:b w:val="0"/>
-                <w:i w:val="0"/>
-                <w:color w:val="000000"/>
-                <w:sz w:val="18"/>
-              </w:rPr>
-              <w:t>13.774</w:t>
+              <w:t>5.926</w:t>
             </w:r>
           </w:p>
         </w:tc>
@@ -662,7 +600,7 @@
       <w:tr>
         <w:tc>
           <w:tcPr>
-            <w:tcW w:type="dxa" w:w="960"/>
+            <w:tcW w:type="dxa" w:w="1080"/>
           </w:tcPr>
           <w:p>
             <w:pPr>
@@ -682,7 +620,7 @@
         </w:tc>
         <w:tc>
           <w:tcPr>
-            <w:tcW w:type="dxa" w:w="960"/>
+            <w:tcW w:type="dxa" w:w="1080"/>
           </w:tcPr>
           <w:p>
             <w:pPr>
@@ -696,13 +634,13 @@
                 <w:color w:val="000000"/>
                 <w:sz w:val="18"/>
               </w:rPr>
-              <w:t>15.498</w:t>
+              <w:t>1.391</w:t>
             </w:r>
           </w:p>
         </w:tc>
         <w:tc>
           <w:tcPr>
-            <w:tcW w:type="dxa" w:w="960"/>
+            <w:tcW w:type="dxa" w:w="1080"/>
           </w:tcPr>
           <w:p>
             <w:pPr>
@@ -716,13 +654,13 @@
                 <w:color w:val="000000"/>
                 <w:sz w:val="18"/>
               </w:rPr>
-              <w:t>34.915</w:t>
+              <w:t>23.878</w:t>
             </w:r>
           </w:p>
         </w:tc>
         <w:tc>
           <w:tcPr>
-            <w:tcW w:type="dxa" w:w="960"/>
+            <w:tcW w:type="dxa" w:w="1080"/>
           </w:tcPr>
           <w:p>
             <w:pPr>
@@ -736,13 +674,13 @@
                 <w:color w:val="000000"/>
                 <w:sz w:val="18"/>
               </w:rPr>
-              <w:t>10.975</w:t>
+              <w:t>22.132</w:t>
             </w:r>
           </w:p>
         </w:tc>
         <w:tc>
           <w:tcPr>
-            <w:tcW w:type="dxa" w:w="960"/>
+            <w:tcW w:type="dxa" w:w="1080"/>
           </w:tcPr>
           <w:p>
             <w:pPr>
@@ -756,13 +694,13 @@
                 <w:color w:val="000000"/>
                 <w:sz w:val="18"/>
               </w:rPr>
-              <w:t>21.365</w:t>
+              <w:t>22.881</w:t>
             </w:r>
           </w:p>
         </w:tc>
         <w:tc>
           <w:tcPr>
-            <w:tcW w:type="dxa" w:w="960"/>
+            <w:tcW w:type="dxa" w:w="1080"/>
           </w:tcPr>
           <w:p>
             <w:pPr>
@@ -776,13 +714,13 @@
                 <w:color w:val="000000"/>
                 <w:sz w:val="18"/>
               </w:rPr>
-              <w:t>41.142</w:t>
+              <w:t>7.120</w:t>
             </w:r>
           </w:p>
         </w:tc>
         <w:tc>
           <w:tcPr>
-            <w:tcW w:type="dxa" w:w="960"/>
+            <w:tcW w:type="dxa" w:w="1080"/>
           </w:tcPr>
           <w:p>
             <w:pPr>
@@ -796,13 +734,13 @@
                 <w:color w:val="000000"/>
                 <w:sz w:val="18"/>
               </w:rPr>
-              <w:t>9.984</w:t>
+              <w:t>-10.940</w:t>
             </w:r>
           </w:p>
         </w:tc>
         <w:tc>
           <w:tcPr>
-            <w:tcW w:type="dxa" w:w="960"/>
+            <w:tcW w:type="dxa" w:w="1080"/>
           </w:tcPr>
           <w:p>
             <w:pPr>
@@ -816,27 +754,7 @@
                 <w:color w:val="000000"/>
                 <w:sz w:val="18"/>
               </w:rPr>
-              <w:t>1.345</w:t>
-            </w:r>
-          </w:p>
-        </w:tc>
-        <w:tc>
-          <w:tcPr>
-            <w:tcW w:type="dxa" w:w="960"/>
-          </w:tcPr>
-          <w:p>
-            <w:pPr>
-              <w:jc w:val="right"/>
-            </w:pPr>
-            <w:r>
-              <w:rPr>
-                <w:rFonts w:ascii="Calibri" w:hAnsi="Calibri"/>
-                <w:b w:val="0"/>
-                <w:i w:val="0"/>
-                <w:color w:val="000000"/>
-                <w:sz w:val="18"/>
-              </w:rPr>
-              <w:t>30.061</w:t>
+              <w:t>-1.144</w:t>
             </w:r>
           </w:p>
         </w:tc>
@@ -844,7 +762,7 @@
       <w:tr>
         <w:tc>
           <w:tcPr>
-            <w:tcW w:type="dxa" w:w="960"/>
+            <w:tcW w:type="dxa" w:w="1080"/>
           </w:tcPr>
           <w:p>
             <w:pPr>
@@ -864,7 +782,7 @@
         </w:tc>
         <w:tc>
           <w:tcPr>
-            <w:tcW w:type="dxa" w:w="960"/>
+            <w:tcW w:type="dxa" w:w="1080"/>
           </w:tcPr>
           <w:p>
             <w:pPr>
@@ -878,13 +796,13 @@
                 <w:color w:val="000000"/>
                 <w:sz w:val="18"/>
               </w:rPr>
-              <w:t>76.920</w:t>
+              <w:t>18.851</w:t>
             </w:r>
           </w:p>
         </w:tc>
         <w:tc>
           <w:tcPr>
-            <w:tcW w:type="dxa" w:w="960"/>
+            <w:tcW w:type="dxa" w:w="1080"/>
           </w:tcPr>
           <w:p>
             <w:pPr>
@@ -898,13 +816,13 @@
                 <w:color w:val="000000"/>
                 <w:sz w:val="18"/>
               </w:rPr>
-              <w:t>79.151</w:t>
+              <w:t>88.378</w:t>
             </w:r>
           </w:p>
         </w:tc>
         <w:tc>
           <w:tcPr>
-            <w:tcW w:type="dxa" w:w="960"/>
+            <w:tcW w:type="dxa" w:w="1080"/>
           </w:tcPr>
           <w:p>
             <w:pPr>
@@ -918,13 +836,13 @@
                 <w:color w:val="000000"/>
                 <w:sz w:val="18"/>
               </w:rPr>
-              <w:t>93.990</w:t>
+              <w:t>86.647</w:t>
             </w:r>
           </w:p>
         </w:tc>
         <w:tc>
           <w:tcPr>
-            <w:tcW w:type="dxa" w:w="960"/>
+            <w:tcW w:type="dxa" w:w="1080"/>
           </w:tcPr>
           <w:p>
             <w:pPr>
@@ -938,13 +856,13 @@
                 <w:color w:val="000000"/>
                 <w:sz w:val="18"/>
               </w:rPr>
-              <w:t>97.500</w:t>
+              <w:t>68.549</w:t>
             </w:r>
           </w:p>
         </w:tc>
         <w:tc>
           <w:tcPr>
-            <w:tcW w:type="dxa" w:w="960"/>
+            <w:tcW w:type="dxa" w:w="1080"/>
           </w:tcPr>
           <w:p>
             <w:pPr>
@@ -958,13 +876,13 @@
                 <w:color w:val="000000"/>
                 <w:sz w:val="18"/>
               </w:rPr>
-              <w:t>81.020</w:t>
+              <w:t>11.414</w:t>
             </w:r>
           </w:p>
         </w:tc>
         <w:tc>
           <w:tcPr>
-            <w:tcW w:type="dxa" w:w="960"/>
+            <w:tcW w:type="dxa" w:w="1080"/>
           </w:tcPr>
           <w:p>
             <w:pPr>
@@ -978,13 +896,13 @@
                 <w:color w:val="000000"/>
                 <w:sz w:val="18"/>
               </w:rPr>
-              <w:t>13.545</w:t>
+              <w:t>11.811</w:t>
             </w:r>
           </w:p>
         </w:tc>
         <w:tc>
           <w:tcPr>
-            <w:tcW w:type="dxa" w:w="960"/>
+            <w:tcW w:type="dxa" w:w="1080"/>
           </w:tcPr>
           <w:p>
             <w:pPr>
@@ -998,27 +916,7 @@
                 <w:color w:val="000000"/>
                 <w:sz w:val="18"/>
               </w:rPr>
-              <w:t>11.087</w:t>
-            </w:r>
-          </w:p>
-        </w:tc>
-        <w:tc>
-          <w:tcPr>
-            <w:tcW w:type="dxa" w:w="960"/>
-          </w:tcPr>
-          <w:p>
-            <w:pPr>
-              <w:jc w:val="right"/>
-            </w:pPr>
-            <w:r>
-              <w:rPr>
-                <w:rFonts w:ascii="Calibri" w:hAnsi="Calibri"/>
-                <w:b w:val="0"/>
-                <w:i w:val="0"/>
-                <w:color w:val="000000"/>
-                <w:sz w:val="18"/>
-              </w:rPr>
-              <w:t>76.054</w:t>
+              <w:t>72.309</w:t>
             </w:r>
           </w:p>
         </w:tc>
@@ -1034,12 +932,12 @@
         <w:pStyle w:val="Heading1"/>
       </w:pPr>
       <w:r>
-        <w:t>2. PCA Tabanlı Ağırlıklandırma Sonuçları</w:t>
+        <w:t>2. PCA Tabanlı Değişken Ağırlıkları</w:t>
       </w:r>
     </w:p>
     <w:p>
       <w:r>
-        <w:t>Her bir sürdürülebilirlik boyutu için ilk temel bileşen (PC1) analizine göre belirlenen ağırlık yükleri Tablo 2'de sunulmuştur. En yüksek açıklayıcılık oranına sahip boyut %70'in üzerindeki varyans açıklamasıyla TEXTIndex olarak gözlenmiştir.</w:t>
+        <w:t>WDI değişkenlerinin ilk temel bileşen yük değerlerine göre türetilen ağırlık listesi Tablo 2'de sunulmuştur.</w:t>
       </w:r>
     </w:p>
     <w:tbl>
@@ -1184,7 +1082,7 @@
                 <w:color w:val="000000"/>
                 <w:sz w:val="18"/>
               </w:rPr>
-              <w:t>scope1_tco2e</w:t>
+              <w:t>CO2_kt</w:t>
             </w:r>
           </w:p>
         </w:tc>
@@ -1204,7 +1102,7 @@
                 <w:color w:val="000000"/>
                 <w:sz w:val="18"/>
               </w:rPr>
-              <w:t>0.0277</w:t>
+              <w:t>0.1046</w:t>
             </w:r>
           </w:p>
         </w:tc>
@@ -1224,7 +1122,7 @@
                 <w:color w:val="000000"/>
                 <w:sz w:val="18"/>
               </w:rPr>
-              <w:t>% 30.16</w:t>
+              <w:t>% 38.88</w:t>
             </w:r>
           </w:p>
         </w:tc>
@@ -1266,7 +1164,7 @@
                 <w:color w:val="000000"/>
                 <w:sz w:val="18"/>
               </w:rPr>
-              <w:t>scope2_tco2e</w:t>
+              <w:t>Total_GHG</w:t>
             </w:r>
           </w:p>
         </w:tc>
@@ -1286,7 +1184,7 @@
                 <w:color w:val="000000"/>
                 <w:sz w:val="18"/>
               </w:rPr>
-              <w:t>0.0319</w:t>
+              <w:t>0.1060</w:t>
             </w:r>
           </w:p>
         </w:tc>
@@ -1306,7 +1204,7 @@
                 <w:color w:val="000000"/>
                 <w:sz w:val="18"/>
               </w:rPr>
-              <w:t>% 30.16</w:t>
+              <w:t>% 38.88</w:t>
             </w:r>
           </w:p>
         </w:tc>
@@ -1348,7 +1246,7 @@
                 <w:color w:val="000000"/>
                 <w:sz w:val="18"/>
               </w:rPr>
-              <w:t>scope3_tco2e</w:t>
+              <w:t>Methane_emissions</w:t>
             </w:r>
           </w:p>
         </w:tc>
@@ -1368,7 +1266,7 @@
                 <w:color w:val="000000"/>
                 <w:sz w:val="18"/>
               </w:rPr>
-              <w:t>0.1873</w:t>
+              <w:t>0.1065</w:t>
             </w:r>
           </w:p>
         </w:tc>
@@ -1388,7 +1286,7 @@
                 <w:color w:val="000000"/>
                 <w:sz w:val="18"/>
               </w:rPr>
-              <w:t>% 30.16</w:t>
+              <w:t>% 38.88</w:t>
             </w:r>
           </w:p>
         </w:tc>
@@ -1430,7 +1328,7 @@
                 <w:color w:val="000000"/>
                 <w:sz w:val="18"/>
               </w:rPr>
-              <w:t>total_ghg_tco2e</w:t>
+              <w:t>Nitrous_oxide_emissions</w:t>
             </w:r>
           </w:p>
         </w:tc>
@@ -1450,7 +1348,7 @@
                 <w:color w:val="000000"/>
                 <w:sz w:val="18"/>
               </w:rPr>
-              <w:t>0.1931</w:t>
+              <w:t>0.1073</w:t>
             </w:r>
           </w:p>
         </w:tc>
@@ -1470,7 +1368,7 @@
                 <w:color w:val="000000"/>
                 <w:sz w:val="18"/>
               </w:rPr>
-              <w:t>% 30.16</w:t>
+              <w:t>% 38.88</w:t>
             </w:r>
           </w:p>
         </w:tc>
@@ -1512,7 +1410,7 @@
                 <w:color w:val="000000"/>
                 <w:sz w:val="18"/>
               </w:rPr>
-              <w:t>renewable_energy_ratio</w:t>
+              <w:t>Renewable_energy_consumption_pct</w:t>
             </w:r>
           </w:p>
         </w:tc>
@@ -1532,7 +1430,7 @@
                 <w:color w:val="000000"/>
                 <w:sz w:val="18"/>
               </w:rPr>
-              <w:t>0.0844</w:t>
+              <w:t>0.0412</w:t>
             </w:r>
           </w:p>
         </w:tc>
@@ -1552,7 +1450,7 @@
                 <w:color w:val="000000"/>
                 <w:sz w:val="18"/>
               </w:rPr>
-              <w:t>% 30.16</w:t>
+              <w:t>% 38.88</w:t>
             </w:r>
           </w:p>
         </w:tc>
@@ -1594,7 +1492,7 @@
                 <w:color w:val="000000"/>
                 <w:sz w:val="18"/>
               </w:rPr>
-              <w:t>energy_consumption_mwh</w:t>
+              <w:t>Renewable_electricity_pct</w:t>
             </w:r>
           </w:p>
         </w:tc>
@@ -1614,7 +1512,7 @@
                 <w:color w:val="000000"/>
                 <w:sz w:val="18"/>
               </w:rPr>
-              <w:t>0.0782</w:t>
+              <w:t>0.0667</w:t>
             </w:r>
           </w:p>
         </w:tc>
@@ -1634,7 +1532,7 @@
                 <w:color w:val="000000"/>
                 <w:sz w:val="18"/>
               </w:rPr>
-              <w:t>% 30.16</w:t>
+              <w:t>% 38.88</w:t>
             </w:r>
           </w:p>
         </w:tc>
@@ -1676,7 +1574,7 @@
                 <w:color w:val="000000"/>
                 <w:sz w:val="18"/>
               </w:rPr>
-              <w:t>water_consumption_m3</w:t>
+              <w:t>Forest_area_pct</w:t>
             </w:r>
           </w:p>
         </w:tc>
@@ -1696,7 +1594,7 @@
                 <w:color w:val="000000"/>
                 <w:sz w:val="18"/>
               </w:rPr>
-              <w:t>0.1052</w:t>
+              <w:t>0.0478</w:t>
             </w:r>
           </w:p>
         </w:tc>
@@ -1716,7 +1614,7 @@
                 <w:color w:val="000000"/>
                 <w:sz w:val="18"/>
               </w:rPr>
-              <w:t>% 30.16</w:t>
+              <w:t>% 38.88</w:t>
             </w:r>
           </w:p>
         </w:tc>
@@ -1758,7 +1656,7 @@
                 <w:color w:val="000000"/>
                 <w:sz w:val="18"/>
               </w:rPr>
-              <w:t>waste_ton</w:t>
+              <w:t>PM25_pollution</w:t>
             </w:r>
           </w:p>
         </w:tc>
@@ -1778,7 +1676,7 @@
                 <w:color w:val="000000"/>
                 <w:sz w:val="18"/>
               </w:rPr>
-              <w:t>0.1632</w:t>
+              <w:t>0.0942</w:t>
             </w:r>
           </w:p>
         </w:tc>
@@ -1798,7 +1696,7 @@
                 <w:color w:val="000000"/>
                 <w:sz w:val="18"/>
               </w:rPr>
-              <w:t>% 30.16</w:t>
+              <w:t>% 38.88</w:t>
             </w:r>
           </w:p>
         </w:tc>
@@ -1840,7 +1738,7 @@
                 <w:color w:val="000000"/>
                 <w:sz w:val="18"/>
               </w:rPr>
-              <w:t>net_zero_target</w:t>
+              <w:t>Access_to_electricity</w:t>
             </w:r>
           </w:p>
         </w:tc>
@@ -1860,7 +1758,7 @@
                 <w:color w:val="000000"/>
                 <w:sz w:val="18"/>
               </w:rPr>
-              <w:t>0.0925</w:t>
+              <w:t>0.0526</w:t>
             </w:r>
           </w:p>
         </w:tc>
@@ -1880,7 +1778,7 @@
                 <w:color w:val="000000"/>
                 <w:sz w:val="18"/>
               </w:rPr>
-              <w:t>% 30.16</w:t>
+              <w:t>% 38.88</w:t>
             </w:r>
           </w:p>
         </w:tc>
@@ -1922,7 +1820,7 @@
                 <w:color w:val="000000"/>
                 <w:sz w:val="18"/>
               </w:rPr>
-              <w:t>emission_reduction_target</w:t>
+              <w:t>Natural_resources_rents_pct</w:t>
             </w:r>
           </w:p>
         </w:tc>
@@ -1942,7 +1840,7 @@
                 <w:color w:val="000000"/>
                 <w:sz w:val="18"/>
               </w:rPr>
-              <w:t>0.0364</w:t>
+              <w:t>0.0160</w:t>
             </w:r>
           </w:p>
         </w:tc>
@@ -1962,7 +1860,335 @@
                 <w:color w:val="000000"/>
                 <w:sz w:val="18"/>
               </w:rPr>
-              <w:t>% 30.16</w:t>
+              <w:t>% 38.88</w:t>
+            </w:r>
+          </w:p>
+        </w:tc>
+      </w:tr>
+      <w:tr>
+        <w:tc>
+          <w:tcPr>
+            <w:tcW w:type="dxa" w:w="2160"/>
+          </w:tcPr>
+          <w:p>
+            <w:pPr>
+              <w:jc w:val="left"/>
+            </w:pPr>
+            <w:r>
+              <w:rPr>
+                <w:rFonts w:ascii="Calibri" w:hAnsi="Calibri"/>
+                <w:b w:val="0"/>
+                <w:i w:val="0"/>
+                <w:color w:val="000000"/>
+                <w:sz w:val="18"/>
+              </w:rPr>
+              <w:t>Environmental</w:t>
+            </w:r>
+          </w:p>
+        </w:tc>
+        <w:tc>
+          <w:tcPr>
+            <w:tcW w:type="dxa" w:w="2160"/>
+          </w:tcPr>
+          <w:p>
+            <w:pPr>
+              <w:jc w:val="left"/>
+            </w:pPr>
+            <w:r>
+              <w:rPr>
+                <w:rFonts w:ascii="Calibri" w:hAnsi="Calibri"/>
+                <w:b w:val="0"/>
+                <w:i w:val="0"/>
+                <w:color w:val="000000"/>
+                <w:sz w:val="18"/>
+              </w:rPr>
+              <w:t>Agricultural_land_pct</w:t>
+            </w:r>
+          </w:p>
+        </w:tc>
+        <w:tc>
+          <w:tcPr>
+            <w:tcW w:type="dxa" w:w="2160"/>
+          </w:tcPr>
+          <w:p>
+            <w:pPr>
+              <w:jc w:val="right"/>
+            </w:pPr>
+            <w:r>
+              <w:rPr>
+                <w:rFonts w:ascii="Calibri" w:hAnsi="Calibri"/>
+                <w:b w:val="0"/>
+                <w:i w:val="0"/>
+                <w:color w:val="000000"/>
+                <w:sz w:val="18"/>
+              </w:rPr>
+              <w:t>0.0656</w:t>
+            </w:r>
+          </w:p>
+        </w:tc>
+        <w:tc>
+          <w:tcPr>
+            <w:tcW w:type="dxa" w:w="2160"/>
+          </w:tcPr>
+          <w:p>
+            <w:pPr>
+              <w:jc w:val="right"/>
+            </w:pPr>
+            <w:r>
+              <w:rPr>
+                <w:rFonts w:ascii="Calibri" w:hAnsi="Calibri"/>
+                <w:b w:val="0"/>
+                <w:i w:val="0"/>
+                <w:color w:val="000000"/>
+                <w:sz w:val="18"/>
+              </w:rPr>
+              <w:t>% 38.88</w:t>
+            </w:r>
+          </w:p>
+        </w:tc>
+      </w:tr>
+      <w:tr>
+        <w:tc>
+          <w:tcPr>
+            <w:tcW w:type="dxa" w:w="2160"/>
+          </w:tcPr>
+          <w:p>
+            <w:pPr>
+              <w:jc w:val="left"/>
+            </w:pPr>
+            <w:r>
+              <w:rPr>
+                <w:rFonts w:ascii="Calibri" w:hAnsi="Calibri"/>
+                <w:b w:val="0"/>
+                <w:i w:val="0"/>
+                <w:color w:val="000000"/>
+                <w:sz w:val="18"/>
+              </w:rPr>
+              <w:t>Environmental</w:t>
+            </w:r>
+          </w:p>
+        </w:tc>
+        <w:tc>
+          <w:tcPr>
+            <w:tcW w:type="dxa" w:w="2160"/>
+          </w:tcPr>
+          <w:p>
+            <w:pPr>
+              <w:jc w:val="left"/>
+            </w:pPr>
+            <w:r>
+              <w:rPr>
+                <w:rFonts w:ascii="Calibri" w:hAnsi="Calibri"/>
+                <w:b w:val="0"/>
+                <w:i w:val="0"/>
+                <w:color w:val="000000"/>
+                <w:sz w:val="18"/>
+              </w:rPr>
+              <w:t>Protected_areas_pct</w:t>
+            </w:r>
+          </w:p>
+        </w:tc>
+        <w:tc>
+          <w:tcPr>
+            <w:tcW w:type="dxa" w:w="2160"/>
+          </w:tcPr>
+          <w:p>
+            <w:pPr>
+              <w:jc w:val="right"/>
+            </w:pPr>
+            <w:r>
+              <w:rPr>
+                <w:rFonts w:ascii="Calibri" w:hAnsi="Calibri"/>
+                <w:b w:val="0"/>
+                <w:i w:val="0"/>
+                <w:color w:val="000000"/>
+                <w:sz w:val="18"/>
+              </w:rPr>
+              <w:t>0.0112</w:t>
+            </w:r>
+          </w:p>
+        </w:tc>
+        <w:tc>
+          <w:tcPr>
+            <w:tcW w:type="dxa" w:w="2160"/>
+          </w:tcPr>
+          <w:p>
+            <w:pPr>
+              <w:jc w:val="right"/>
+            </w:pPr>
+            <w:r>
+              <w:rPr>
+                <w:rFonts w:ascii="Calibri" w:hAnsi="Calibri"/>
+                <w:b w:val="0"/>
+                <w:i w:val="0"/>
+                <w:color w:val="000000"/>
+                <w:sz w:val="18"/>
+              </w:rPr>
+              <w:t>% 38.88</w:t>
+            </w:r>
+          </w:p>
+        </w:tc>
+      </w:tr>
+      <w:tr>
+        <w:tc>
+          <w:tcPr>
+            <w:tcW w:type="dxa" w:w="2160"/>
+          </w:tcPr>
+          <w:p>
+            <w:pPr>
+              <w:jc w:val="left"/>
+            </w:pPr>
+            <w:r>
+              <w:rPr>
+                <w:rFonts w:ascii="Calibri" w:hAnsi="Calibri"/>
+                <w:b w:val="0"/>
+                <w:i w:val="0"/>
+                <w:color w:val="000000"/>
+                <w:sz w:val="18"/>
+              </w:rPr>
+              <w:t>Environmental</w:t>
+            </w:r>
+          </w:p>
+        </w:tc>
+        <w:tc>
+          <w:tcPr>
+            <w:tcW w:type="dxa" w:w="2160"/>
+          </w:tcPr>
+          <w:p>
+            <w:pPr>
+              <w:jc w:val="left"/>
+            </w:pPr>
+            <w:r>
+              <w:rPr>
+                <w:rFonts w:ascii="Calibri" w:hAnsi="Calibri"/>
+                <w:b w:val="0"/>
+                <w:i w:val="0"/>
+                <w:color w:val="000000"/>
+                <w:sz w:val="18"/>
+              </w:rPr>
+              <w:t>Energy_use_kg_oil_equiv</w:t>
+            </w:r>
+          </w:p>
+        </w:tc>
+        <w:tc>
+          <w:tcPr>
+            <w:tcW w:type="dxa" w:w="2160"/>
+          </w:tcPr>
+          <w:p>
+            <w:pPr>
+              <w:jc w:val="right"/>
+            </w:pPr>
+            <w:r>
+              <w:rPr>
+                <w:rFonts w:ascii="Calibri" w:hAnsi="Calibri"/>
+                <w:b w:val="0"/>
+                <w:i w:val="0"/>
+                <w:color w:val="000000"/>
+                <w:sz w:val="18"/>
+              </w:rPr>
+              <w:t>0.0801</w:t>
+            </w:r>
+          </w:p>
+        </w:tc>
+        <w:tc>
+          <w:tcPr>
+            <w:tcW w:type="dxa" w:w="2160"/>
+          </w:tcPr>
+          <w:p>
+            <w:pPr>
+              <w:jc w:val="right"/>
+            </w:pPr>
+            <w:r>
+              <w:rPr>
+                <w:rFonts w:ascii="Calibri" w:hAnsi="Calibri"/>
+                <w:b w:val="0"/>
+                <w:i w:val="0"/>
+                <w:color w:val="000000"/>
+                <w:sz w:val="18"/>
+              </w:rPr>
+              <w:t>% 38.88</w:t>
+            </w:r>
+          </w:p>
+        </w:tc>
+      </w:tr>
+      <w:tr>
+        <w:tc>
+          <w:tcPr>
+            <w:tcW w:type="dxa" w:w="2160"/>
+          </w:tcPr>
+          <w:p>
+            <w:pPr>
+              <w:jc w:val="left"/>
+            </w:pPr>
+            <w:r>
+              <w:rPr>
+                <w:rFonts w:ascii="Calibri" w:hAnsi="Calibri"/>
+                <w:b w:val="0"/>
+                <w:i w:val="0"/>
+                <w:color w:val="000000"/>
+                <w:sz w:val="18"/>
+              </w:rPr>
+              <w:t>Environmental</w:t>
+            </w:r>
+          </w:p>
+        </w:tc>
+        <w:tc>
+          <w:tcPr>
+            <w:tcW w:type="dxa" w:w="2160"/>
+          </w:tcPr>
+          <w:p>
+            <w:pPr>
+              <w:jc w:val="left"/>
+            </w:pPr>
+            <w:r>
+              <w:rPr>
+                <w:rFonts w:ascii="Calibri" w:hAnsi="Calibri"/>
+                <w:b w:val="0"/>
+                <w:i w:val="0"/>
+                <w:color w:val="000000"/>
+                <w:sz w:val="18"/>
+              </w:rPr>
+              <w:t>Electricity_from_coal_pct</w:t>
+            </w:r>
+          </w:p>
+        </w:tc>
+        <w:tc>
+          <w:tcPr>
+            <w:tcW w:type="dxa" w:w="2160"/>
+          </w:tcPr>
+          <w:p>
+            <w:pPr>
+              <w:jc w:val="right"/>
+            </w:pPr>
+            <w:r>
+              <w:rPr>
+                <w:rFonts w:ascii="Calibri" w:hAnsi="Calibri"/>
+                <w:b w:val="0"/>
+                <w:i w:val="0"/>
+                <w:color w:val="000000"/>
+                <w:sz w:val="18"/>
+              </w:rPr>
+              <w:t>0.1002</w:t>
+            </w:r>
+          </w:p>
+        </w:tc>
+        <w:tc>
+          <w:tcPr>
+            <w:tcW w:type="dxa" w:w="2160"/>
+          </w:tcPr>
+          <w:p>
+            <w:pPr>
+              <w:jc w:val="right"/>
+            </w:pPr>
+            <w:r>
+              <w:rPr>
+                <w:rFonts w:ascii="Calibri" w:hAnsi="Calibri"/>
+                <w:b w:val="0"/>
+                <w:i w:val="0"/>
+                <w:color w:val="000000"/>
+                <w:sz w:val="18"/>
+              </w:rPr>
+              <w:t>% 38.88</w:t>
             </w:r>
           </w:p>
         </w:tc>
@@ -2004,7 +2230,7 @@
                 <w:color w:val="000000"/>
                 <w:sz w:val="18"/>
               </w:rPr>
-              <w:t>female_employee_ratio</w:t>
+              <w:t>Life_expectancy</w:t>
             </w:r>
           </w:p>
         </w:tc>
@@ -2024,7 +2250,7 @@
                 <w:color w:val="000000"/>
                 <w:sz w:val="18"/>
               </w:rPr>
-              <w:t>0.2923</w:t>
+              <w:t>0.1006</w:t>
             </w:r>
           </w:p>
         </w:tc>
@@ -2044,7 +2270,7 @@
                 <w:color w:val="000000"/>
                 <w:sz w:val="18"/>
               </w:rPr>
-              <w:t>% 47.84</w:t>
+              <w:t>% 48.02</w:t>
             </w:r>
           </w:p>
         </w:tc>
@@ -2086,7 +2312,7 @@
                 <w:color w:val="000000"/>
                 <w:sz w:val="18"/>
               </w:rPr>
-              <w:t>training_hours_per_employee</w:t>
+              <w:t>Under_5_mortality_rate</w:t>
             </w:r>
           </w:p>
         </w:tc>
@@ -2106,7 +2332,7 @@
                 <w:color w:val="000000"/>
                 <w:sz w:val="18"/>
               </w:rPr>
-              <w:t>0.3156</w:t>
+              <w:t>0.1036</w:t>
             </w:r>
           </w:p>
         </w:tc>
@@ -2126,7 +2352,7 @@
                 <w:color w:val="000000"/>
                 <w:sz w:val="18"/>
               </w:rPr>
-              <w:t>% 47.84</w:t>
+              <w:t>% 48.02</w:t>
             </w:r>
           </w:p>
         </w:tc>
@@ -2168,7 +2394,7 @@
                 <w:color w:val="000000"/>
                 <w:sz w:val="18"/>
               </w:rPr>
-              <w:t>occupational_accident_rate</w:t>
+              <w:t>Safe_drinking_water_pct</w:t>
             </w:r>
           </w:p>
         </w:tc>
@@ -2188,7 +2414,7 @@
                 <w:color w:val="000000"/>
                 <w:sz w:val="18"/>
               </w:rPr>
-              <w:t>0.3921</w:t>
+              <w:t>0.0928</w:t>
             </w:r>
           </w:p>
         </w:tc>
@@ -2208,7 +2434,7 @@
                 <w:color w:val="000000"/>
                 <w:sz w:val="18"/>
               </w:rPr>
-              <w:t>% 47.84</w:t>
+              <w:t>% 48.02</w:t>
             </w:r>
           </w:p>
         </w:tc>
@@ -2230,7 +2456,7 @@
                 <w:color w:val="000000"/>
                 <w:sz w:val="18"/>
               </w:rPr>
-              <w:t>Governance</w:t>
+              <w:t>Social</w:t>
             </w:r>
           </w:p>
         </w:tc>
@@ -2250,7 +2476,7 @@
                 <w:color w:val="000000"/>
                 <w:sz w:val="18"/>
               </w:rPr>
-              <w:t>board_independence_ratio</w:t>
+              <w:t>Safe_sanitation_pct</w:t>
             </w:r>
           </w:p>
         </w:tc>
@@ -2270,7 +2496,7 @@
                 <w:color w:val="000000"/>
                 <w:sz w:val="18"/>
               </w:rPr>
-              <w:t>0.0486</w:t>
+              <w:t>0.0901</w:t>
             </w:r>
           </w:p>
         </w:tc>
@@ -2290,7 +2516,7 @@
                 <w:color w:val="000000"/>
                 <w:sz w:val="18"/>
               </w:rPr>
-              <w:t>% 27.00</w:t>
+              <w:t>% 48.02</w:t>
             </w:r>
           </w:p>
         </w:tc>
@@ -2312,7 +2538,7 @@
                 <w:color w:val="000000"/>
                 <w:sz w:val="18"/>
               </w:rPr>
-              <w:t>Governance</w:t>
+              <w:t>Social</w:t>
             </w:r>
           </w:p>
         </w:tc>
@@ -2332,7 +2558,7 @@
                 <w:color w:val="000000"/>
                 <w:sz w:val="18"/>
               </w:rPr>
-              <w:t>female_board_ratio</w:t>
+              <w:t>Primary_school_enrollment</w:t>
             </w:r>
           </w:p>
         </w:tc>
@@ -2352,7 +2578,7 @@
                 <w:color w:val="000000"/>
                 <w:sz w:val="18"/>
               </w:rPr>
-              <w:t>0.4046</w:t>
+              <w:t>0.0237</w:t>
             </w:r>
           </w:p>
         </w:tc>
@@ -2372,7 +2598,7 @@
                 <w:color w:val="000000"/>
                 <w:sz w:val="18"/>
               </w:rPr>
-              <w:t>% 27.00</w:t>
+              <w:t>% 48.02</w:t>
             </w:r>
           </w:p>
         </w:tc>
@@ -2394,7 +2620,7 @@
                 <w:color w:val="000000"/>
                 <w:sz w:val="18"/>
               </w:rPr>
-              <w:t>Governance</w:t>
+              <w:t>Social</w:t>
             </w:r>
           </w:p>
         </w:tc>
@@ -2414,7 +2640,7 @@
                 <w:color w:val="000000"/>
                 <w:sz w:val="18"/>
               </w:rPr>
-              <w:t>esg_committee</w:t>
+              <w:t>Secondary_school_enrollment</w:t>
             </w:r>
           </w:p>
         </w:tc>
@@ -2434,7 +2660,7 @@
                 <w:color w:val="000000"/>
                 <w:sz w:val="18"/>
               </w:rPr>
-              <w:t>0.3139</w:t>
+              <w:t>0.0658</w:t>
             </w:r>
           </w:p>
         </w:tc>
@@ -2454,7 +2680,7 @@
                 <w:color w:val="000000"/>
                 <w:sz w:val="18"/>
               </w:rPr>
-              <w:t>% 27.00</w:t>
+              <w:t>% 48.02</w:t>
             </w:r>
           </w:p>
         </w:tc>
@@ -2476,7 +2702,7 @@
                 <w:color w:val="000000"/>
                 <w:sz w:val="18"/>
               </w:rPr>
-              <w:t>Governance</w:t>
+              <w:t>Social</w:t>
             </w:r>
           </w:p>
         </w:tc>
@@ -2496,7 +2722,7 @@
                 <w:color w:val="000000"/>
                 <w:sz w:val="18"/>
               </w:rPr>
-              <w:t>ethics_policy</w:t>
+              <w:t>Tertiary_school_enrollment</w:t>
             </w:r>
           </w:p>
         </w:tc>
@@ -2516,7 +2742,7 @@
                 <w:color w:val="000000"/>
                 <w:sz w:val="18"/>
               </w:rPr>
-              <w:t>0.0796</w:t>
+              <w:t>0.0852</w:t>
             </w:r>
           </w:p>
         </w:tc>
@@ -2536,7 +2762,7 @@
                 <w:color w:val="000000"/>
                 <w:sz w:val="18"/>
               </w:rPr>
-              <w:t>% 27.00</w:t>
+              <w:t>% 48.02</w:t>
             </w:r>
           </w:p>
         </w:tc>
@@ -2558,7 +2784,7 @@
                 <w:color w:val="000000"/>
                 <w:sz w:val="18"/>
               </w:rPr>
-              <w:t>Governance</w:t>
+              <w:t>Social</w:t>
             </w:r>
           </w:p>
         </w:tc>
@@ -2578,7 +2804,7 @@
                 <w:color w:val="000000"/>
                 <w:sz w:val="18"/>
               </w:rPr>
-              <w:t>anti_corruption_policy</w:t>
+              <w:t>Adult_literacy_rate</w:t>
             </w:r>
           </w:p>
         </w:tc>
@@ -2598,7 +2824,7 @@
                 <w:color w:val="000000"/>
                 <w:sz w:val="18"/>
               </w:rPr>
-              <w:t>0.1534</w:t>
+              <w:t>0.0732</w:t>
             </w:r>
           </w:p>
         </w:tc>
@@ -2618,7 +2844,7 @@
                 <w:color w:val="000000"/>
                 <w:sz w:val="18"/>
               </w:rPr>
-              <w:t>% 27.00</w:t>
+              <w:t>% 48.02</w:t>
             </w:r>
           </w:p>
         </w:tc>
@@ -2640,7 +2866,7 @@
                 <w:color w:val="000000"/>
                 <w:sz w:val="18"/>
               </w:rPr>
-              <w:t>Text-based</w:t>
+              <w:t>Social</w:t>
             </w:r>
           </w:p>
         </w:tc>
@@ -2660,7 +2886,7 @@
                 <w:color w:val="000000"/>
                 <w:sz w:val="18"/>
               </w:rPr>
-              <w:t>gri_score</w:t>
+              <w:t>Unemployment_pct</w:t>
             </w:r>
           </w:p>
         </w:tc>
@@ -2680,7 +2906,7 @@
                 <w:color w:val="000000"/>
                 <w:sz w:val="18"/>
               </w:rPr>
-              <w:t>0.0920</w:t>
+              <w:t>0.0462</w:t>
             </w:r>
           </w:p>
         </w:tc>
@@ -2700,7 +2926,7 @@
                 <w:color w:val="000000"/>
                 <w:sz w:val="18"/>
               </w:rPr>
-              <w:t>% 30.51</w:t>
+              <w:t>% 48.02</w:t>
             </w:r>
           </w:p>
         </w:tc>
@@ -2722,7 +2948,7 @@
                 <w:color w:val="000000"/>
                 <w:sz w:val="18"/>
               </w:rPr>
-              <w:t>Text-based</w:t>
+              <w:t>Social</w:t>
             </w:r>
           </w:p>
         </w:tc>
@@ -2742,7 +2968,7 @@
                 <w:color w:val="000000"/>
                 <w:sz w:val="18"/>
               </w:rPr>
-              <w:t>tcfd_score</w:t>
+              <w:t>Female_labor_participation_pct</w:t>
             </w:r>
           </w:p>
         </w:tc>
@@ -2762,7 +2988,7 @@
                 <w:color w:val="000000"/>
                 <w:sz w:val="18"/>
               </w:rPr>
-              <w:t>0.1538</w:t>
+              <w:t>0.0717</w:t>
             </w:r>
           </w:p>
         </w:tc>
@@ -2782,7 +3008,7 @@
                 <w:color w:val="000000"/>
                 <w:sz w:val="18"/>
               </w:rPr>
-              <w:t>% 30.51</w:t>
+              <w:t>% 48.02</w:t>
             </w:r>
           </w:p>
         </w:tc>
@@ -2804,7 +3030,7 @@
                 <w:color w:val="000000"/>
                 <w:sz w:val="18"/>
               </w:rPr>
-              <w:t>Text-based</w:t>
+              <w:t>Social</w:t>
             </w:r>
           </w:p>
         </w:tc>
@@ -2824,7 +3050,7 @@
                 <w:color w:val="000000"/>
                 <w:sz w:val="18"/>
               </w:rPr>
-              <w:t>vague_statement_ratio</w:t>
+              <w:t>Gini_index</w:t>
             </w:r>
           </w:p>
         </w:tc>
@@ -2844,7 +3070,7 @@
                 <w:color w:val="000000"/>
                 <w:sz w:val="18"/>
               </w:rPr>
-              <w:t>0.1951</w:t>
+              <w:t>0.0599</w:t>
             </w:r>
           </w:p>
         </w:tc>
@@ -2864,7 +3090,7 @@
                 <w:color w:val="000000"/>
                 <w:sz w:val="18"/>
               </w:rPr>
-              <w:t>% 30.51</w:t>
+              <w:t>% 48.02</w:t>
             </w:r>
           </w:p>
         </w:tc>
@@ -2886,7 +3112,7 @@
                 <w:color w:val="000000"/>
                 <w:sz w:val="18"/>
               </w:rPr>
-              <w:t>Text-based</w:t>
+              <w:t>Social</w:t>
             </w:r>
           </w:p>
         </w:tc>
@@ -2906,7 +3132,7 @@
                 <w:color w:val="000000"/>
                 <w:sz w:val="18"/>
               </w:rPr>
-              <w:t>quantitative_evidence_ratio</w:t>
+              <w:t>Poverty_headcount_ratio</w:t>
             </w:r>
           </w:p>
         </w:tc>
@@ -2926,7 +3152,7 @@
                 <w:color w:val="000000"/>
                 <w:sz w:val="18"/>
               </w:rPr>
-              <w:t>0.1157</w:t>
+              <w:t>0.0723</w:t>
             </w:r>
           </w:p>
         </w:tc>
@@ -2946,7 +3172,7 @@
                 <w:color w:val="000000"/>
                 <w:sz w:val="18"/>
               </w:rPr>
-              <w:t>% 30.51</w:t>
+              <w:t>% 48.02</w:t>
             </w:r>
           </w:p>
         </w:tc>
@@ -2968,7 +3194,7 @@
                 <w:color w:val="000000"/>
                 <w:sz w:val="18"/>
               </w:rPr>
-              <w:t>Text-based</w:t>
+              <w:t>Social</w:t>
             </w:r>
           </w:p>
         </w:tc>
@@ -2988,7 +3214,7 @@
                 <w:color w:val="000000"/>
                 <w:sz w:val="18"/>
               </w:rPr>
-              <w:t>evidence_backed_claim_ratio</w:t>
+              <w:t>Clean_fuel_access_pct</w:t>
             </w:r>
           </w:p>
         </w:tc>
@@ -3008,7 +3234,7 @@
                 <w:color w:val="000000"/>
                 <w:sz w:val="18"/>
               </w:rPr>
-              <w:t>0.1721</w:t>
+              <w:t>0.0889</w:t>
             </w:r>
           </w:p>
         </w:tc>
@@ -3028,7 +3254,7 @@
                 <w:color w:val="000000"/>
                 <w:sz w:val="18"/>
               </w:rPr>
-              <w:t>% 30.51</w:t>
+              <w:t>% 48.02</w:t>
             </w:r>
           </w:p>
         </w:tc>
@@ -3050,7 +3276,7 @@
                 <w:color w:val="000000"/>
                 <w:sz w:val="18"/>
               </w:rPr>
-              <w:t>Text-based</w:t>
+              <w:t>Social</w:t>
             </w:r>
           </w:p>
         </w:tc>
@@ -3070,7 +3296,7 @@
                 <w:color w:val="000000"/>
                 <w:sz w:val="18"/>
               </w:rPr>
-              <w:t>positive_sentiment_score</w:t>
+              <w:t>CPIA_gender_equality_rating</w:t>
             </w:r>
           </w:p>
         </w:tc>
@@ -3090,7 +3316,7 @@
                 <w:color w:val="000000"/>
                 <w:sz w:val="18"/>
               </w:rPr>
-              <w:t>0.2713</w:t>
+              <w:t>0.0260</w:t>
             </w:r>
           </w:p>
         </w:tc>
@@ -3110,7 +3336,827 @@
                 <w:color w:val="000000"/>
                 <w:sz w:val="18"/>
               </w:rPr>
-              <w:t>% 30.51</w:t>
+              <w:t>% 48.02</w:t>
+            </w:r>
+          </w:p>
+        </w:tc>
+      </w:tr>
+      <w:tr>
+        <w:tc>
+          <w:tcPr>
+            <w:tcW w:type="dxa" w:w="2160"/>
+          </w:tcPr>
+          <w:p>
+            <w:pPr>
+              <w:jc w:val="left"/>
+            </w:pPr>
+            <w:r>
+              <w:rPr>
+                <w:rFonts w:ascii="Calibri" w:hAnsi="Calibri"/>
+                <w:b w:val="0"/>
+                <w:i w:val="0"/>
+                <w:color w:val="000000"/>
+                <w:sz w:val="18"/>
+              </w:rPr>
+              <w:t>Governance/Macro</w:t>
+            </w:r>
+          </w:p>
+        </w:tc>
+        <w:tc>
+          <w:tcPr>
+            <w:tcW w:type="dxa" w:w="2160"/>
+          </w:tcPr>
+          <w:p>
+            <w:pPr>
+              <w:jc w:val="left"/>
+            </w:pPr>
+            <w:r>
+              <w:rPr>
+                <w:rFonts w:ascii="Calibri" w:hAnsi="Calibri"/>
+                <w:b w:val="0"/>
+                <w:i w:val="0"/>
+                <w:color w:val="000000"/>
+                <w:sz w:val="18"/>
+              </w:rPr>
+              <w:t>Industry_value_added_pct_GDP</w:t>
+            </w:r>
+          </w:p>
+        </w:tc>
+        <w:tc>
+          <w:tcPr>
+            <w:tcW w:type="dxa" w:w="2160"/>
+          </w:tcPr>
+          <w:p>
+            <w:pPr>
+              <w:jc w:val="right"/>
+            </w:pPr>
+            <w:r>
+              <w:rPr>
+                <w:rFonts w:ascii="Calibri" w:hAnsi="Calibri"/>
+                <w:b w:val="0"/>
+                <w:i w:val="0"/>
+                <w:color w:val="000000"/>
+                <w:sz w:val="18"/>
+              </w:rPr>
+              <w:t>0.1349</w:t>
+            </w:r>
+          </w:p>
+        </w:tc>
+        <w:tc>
+          <w:tcPr>
+            <w:tcW w:type="dxa" w:w="2160"/>
+          </w:tcPr>
+          <w:p>
+            <w:pPr>
+              <w:jc w:val="right"/>
+            </w:pPr>
+            <w:r>
+              <w:rPr>
+                <w:rFonts w:ascii="Calibri" w:hAnsi="Calibri"/>
+                <w:b w:val="0"/>
+                <w:i w:val="0"/>
+                <w:color w:val="000000"/>
+                <w:sz w:val="18"/>
+              </w:rPr>
+              <w:t>% 27.83</w:t>
+            </w:r>
+          </w:p>
+        </w:tc>
+      </w:tr>
+      <w:tr>
+        <w:tc>
+          <w:tcPr>
+            <w:tcW w:type="dxa" w:w="2160"/>
+          </w:tcPr>
+          <w:p>
+            <w:pPr>
+              <w:jc w:val="left"/>
+            </w:pPr>
+            <w:r>
+              <w:rPr>
+                <w:rFonts w:ascii="Calibri" w:hAnsi="Calibri"/>
+                <w:b w:val="0"/>
+                <w:i w:val="0"/>
+                <w:color w:val="000000"/>
+                <w:sz w:val="18"/>
+              </w:rPr>
+              <w:t>Governance/Macro</w:t>
+            </w:r>
+          </w:p>
+        </w:tc>
+        <w:tc>
+          <w:tcPr>
+            <w:tcW w:type="dxa" w:w="2160"/>
+          </w:tcPr>
+          <w:p>
+            <w:pPr>
+              <w:jc w:val="left"/>
+            </w:pPr>
+            <w:r>
+              <w:rPr>
+                <w:rFonts w:ascii="Calibri" w:hAnsi="Calibri"/>
+                <w:b w:val="0"/>
+                <w:i w:val="0"/>
+                <w:color w:val="000000"/>
+                <w:sz w:val="18"/>
+              </w:rPr>
+              <w:t>Services_value_added_pct_GDP</w:t>
+            </w:r>
+          </w:p>
+        </w:tc>
+        <w:tc>
+          <w:tcPr>
+            <w:tcW w:type="dxa" w:w="2160"/>
+          </w:tcPr>
+          <w:p>
+            <w:pPr>
+              <w:jc w:val="right"/>
+            </w:pPr>
+            <w:r>
+              <w:rPr>
+                <w:rFonts w:ascii="Calibri" w:hAnsi="Calibri"/>
+                <w:b w:val="0"/>
+                <w:i w:val="0"/>
+                <w:color w:val="000000"/>
+                <w:sz w:val="18"/>
+              </w:rPr>
+              <w:t>0.1902</w:t>
+            </w:r>
+          </w:p>
+        </w:tc>
+        <w:tc>
+          <w:tcPr>
+            <w:tcW w:type="dxa" w:w="2160"/>
+          </w:tcPr>
+          <w:p>
+            <w:pPr>
+              <w:jc w:val="right"/>
+            </w:pPr>
+            <w:r>
+              <w:rPr>
+                <w:rFonts w:ascii="Calibri" w:hAnsi="Calibri"/>
+                <w:b w:val="0"/>
+                <w:i w:val="0"/>
+                <w:color w:val="000000"/>
+                <w:sz w:val="18"/>
+              </w:rPr>
+              <w:t>% 27.83</w:t>
+            </w:r>
+          </w:p>
+        </w:tc>
+      </w:tr>
+      <w:tr>
+        <w:tc>
+          <w:tcPr>
+            <w:tcW w:type="dxa" w:w="2160"/>
+          </w:tcPr>
+          <w:p>
+            <w:pPr>
+              <w:jc w:val="left"/>
+            </w:pPr>
+            <w:r>
+              <w:rPr>
+                <w:rFonts w:ascii="Calibri" w:hAnsi="Calibri"/>
+                <w:b w:val="0"/>
+                <w:i w:val="0"/>
+                <w:color w:val="000000"/>
+                <w:sz w:val="18"/>
+              </w:rPr>
+              <w:t>Governance/Macro</w:t>
+            </w:r>
+          </w:p>
+        </w:tc>
+        <w:tc>
+          <w:tcPr>
+            <w:tcW w:type="dxa" w:w="2160"/>
+          </w:tcPr>
+          <w:p>
+            <w:pPr>
+              <w:jc w:val="left"/>
+            </w:pPr>
+            <w:r>
+              <w:rPr>
+                <w:rFonts w:ascii="Calibri" w:hAnsi="Calibri"/>
+                <w:b w:val="0"/>
+                <w:i w:val="0"/>
+                <w:color w:val="000000"/>
+                <w:sz w:val="18"/>
+              </w:rPr>
+              <w:t>FDI_net_inflow_pct_GDP</w:t>
+            </w:r>
+          </w:p>
+        </w:tc>
+        <w:tc>
+          <w:tcPr>
+            <w:tcW w:type="dxa" w:w="2160"/>
+          </w:tcPr>
+          <w:p>
+            <w:pPr>
+              <w:jc w:val="right"/>
+            </w:pPr>
+            <w:r>
+              <w:rPr>
+                <w:rFonts w:ascii="Calibri" w:hAnsi="Calibri"/>
+                <w:b w:val="0"/>
+                <w:i w:val="0"/>
+                <w:color w:val="000000"/>
+                <w:sz w:val="18"/>
+              </w:rPr>
+              <w:t>0.0140</w:t>
+            </w:r>
+          </w:p>
+        </w:tc>
+        <w:tc>
+          <w:tcPr>
+            <w:tcW w:type="dxa" w:w="2160"/>
+          </w:tcPr>
+          <w:p>
+            <w:pPr>
+              <w:jc w:val="right"/>
+            </w:pPr>
+            <w:r>
+              <w:rPr>
+                <w:rFonts w:ascii="Calibri" w:hAnsi="Calibri"/>
+                <w:b w:val="0"/>
+                <w:i w:val="0"/>
+                <w:color w:val="000000"/>
+                <w:sz w:val="18"/>
+              </w:rPr>
+              <w:t>% 27.83</w:t>
+            </w:r>
+          </w:p>
+        </w:tc>
+      </w:tr>
+      <w:tr>
+        <w:tc>
+          <w:tcPr>
+            <w:tcW w:type="dxa" w:w="2160"/>
+          </w:tcPr>
+          <w:p>
+            <w:pPr>
+              <w:jc w:val="left"/>
+            </w:pPr>
+            <w:r>
+              <w:rPr>
+                <w:rFonts w:ascii="Calibri" w:hAnsi="Calibri"/>
+                <w:b w:val="0"/>
+                <w:i w:val="0"/>
+                <w:color w:val="000000"/>
+                <w:sz w:val="18"/>
+              </w:rPr>
+              <w:t>Governance/Macro</w:t>
+            </w:r>
+          </w:p>
+        </w:tc>
+        <w:tc>
+          <w:tcPr>
+            <w:tcW w:type="dxa" w:w="2160"/>
+          </w:tcPr>
+          <w:p>
+            <w:pPr>
+              <w:jc w:val="left"/>
+            </w:pPr>
+            <w:r>
+              <w:rPr>
+                <w:rFonts w:ascii="Calibri" w:hAnsi="Calibri"/>
+                <w:b w:val="0"/>
+                <w:i w:val="0"/>
+                <w:color w:val="000000"/>
+                <w:sz w:val="18"/>
+              </w:rPr>
+              <w:t>RD_expenditure_pct_GDP</w:t>
+            </w:r>
+          </w:p>
+        </w:tc>
+        <w:tc>
+          <w:tcPr>
+            <w:tcW w:type="dxa" w:w="2160"/>
+          </w:tcPr>
+          <w:p>
+            <w:pPr>
+              <w:jc w:val="right"/>
+            </w:pPr>
+            <w:r>
+              <w:rPr>
+                <w:rFonts w:ascii="Calibri" w:hAnsi="Calibri"/>
+                <w:b w:val="0"/>
+                <w:i w:val="0"/>
+                <w:color w:val="000000"/>
+                <w:sz w:val="18"/>
+              </w:rPr>
+              <w:t>0.1235</w:t>
+            </w:r>
+          </w:p>
+        </w:tc>
+        <w:tc>
+          <w:tcPr>
+            <w:tcW w:type="dxa" w:w="2160"/>
+          </w:tcPr>
+          <w:p>
+            <w:pPr>
+              <w:jc w:val="right"/>
+            </w:pPr>
+            <w:r>
+              <w:rPr>
+                <w:rFonts w:ascii="Calibri" w:hAnsi="Calibri"/>
+                <w:b w:val="0"/>
+                <w:i w:val="0"/>
+                <w:color w:val="000000"/>
+                <w:sz w:val="18"/>
+              </w:rPr>
+              <w:t>% 27.83</w:t>
+            </w:r>
+          </w:p>
+        </w:tc>
+      </w:tr>
+      <w:tr>
+        <w:tc>
+          <w:tcPr>
+            <w:tcW w:type="dxa" w:w="2160"/>
+          </w:tcPr>
+          <w:p>
+            <w:pPr>
+              <w:jc w:val="left"/>
+            </w:pPr>
+            <w:r>
+              <w:rPr>
+                <w:rFonts w:ascii="Calibri" w:hAnsi="Calibri"/>
+                <w:b w:val="0"/>
+                <w:i w:val="0"/>
+                <w:color w:val="000000"/>
+                <w:sz w:val="18"/>
+              </w:rPr>
+              <w:t>Governance/Macro</w:t>
+            </w:r>
+          </w:p>
+        </w:tc>
+        <w:tc>
+          <w:tcPr>
+            <w:tcW w:type="dxa" w:w="2160"/>
+          </w:tcPr>
+          <w:p>
+            <w:pPr>
+              <w:jc w:val="left"/>
+            </w:pPr>
+            <w:r>
+              <w:rPr>
+                <w:rFonts w:ascii="Calibri" w:hAnsi="Calibri"/>
+                <w:b w:val="0"/>
+                <w:i w:val="0"/>
+                <w:color w:val="000000"/>
+                <w:sz w:val="18"/>
+              </w:rPr>
+              <w:t>High_tech_exports_pct_manufactured</w:t>
+            </w:r>
+          </w:p>
+        </w:tc>
+        <w:tc>
+          <w:tcPr>
+            <w:tcW w:type="dxa" w:w="2160"/>
+          </w:tcPr>
+          <w:p>
+            <w:pPr>
+              <w:jc w:val="right"/>
+            </w:pPr>
+            <w:r>
+              <w:rPr>
+                <w:rFonts w:ascii="Calibri" w:hAnsi="Calibri"/>
+                <w:b w:val="0"/>
+                <w:i w:val="0"/>
+                <w:color w:val="000000"/>
+                <w:sz w:val="18"/>
+              </w:rPr>
+              <w:t>0.0690</w:t>
+            </w:r>
+          </w:p>
+        </w:tc>
+        <w:tc>
+          <w:tcPr>
+            <w:tcW w:type="dxa" w:w="2160"/>
+          </w:tcPr>
+          <w:p>
+            <w:pPr>
+              <w:jc w:val="right"/>
+            </w:pPr>
+            <w:r>
+              <w:rPr>
+                <w:rFonts w:ascii="Calibri" w:hAnsi="Calibri"/>
+                <w:b w:val="0"/>
+                <w:i w:val="0"/>
+                <w:color w:val="000000"/>
+                <w:sz w:val="18"/>
+              </w:rPr>
+              <w:t>% 27.83</w:t>
+            </w:r>
+          </w:p>
+        </w:tc>
+      </w:tr>
+      <w:tr>
+        <w:tc>
+          <w:tcPr>
+            <w:tcW w:type="dxa" w:w="2160"/>
+          </w:tcPr>
+          <w:p>
+            <w:pPr>
+              <w:jc w:val="left"/>
+            </w:pPr>
+            <w:r>
+              <w:rPr>
+                <w:rFonts w:ascii="Calibri" w:hAnsi="Calibri"/>
+                <w:b w:val="0"/>
+                <w:i w:val="0"/>
+                <w:color w:val="000000"/>
+                <w:sz w:val="18"/>
+              </w:rPr>
+              <w:t>Governance/Macro</w:t>
+            </w:r>
+          </w:p>
+        </w:tc>
+        <w:tc>
+          <w:tcPr>
+            <w:tcW w:type="dxa" w:w="2160"/>
+          </w:tcPr>
+          <w:p>
+            <w:pPr>
+              <w:jc w:val="left"/>
+            </w:pPr>
+            <w:r>
+              <w:rPr>
+                <w:rFonts w:ascii="Calibri" w:hAnsi="Calibri"/>
+                <w:b w:val="0"/>
+                <w:i w:val="0"/>
+                <w:color w:val="000000"/>
+                <w:sz w:val="18"/>
+              </w:rPr>
+              <w:t>Patent_applications_residents</w:t>
+            </w:r>
+          </w:p>
+        </w:tc>
+        <w:tc>
+          <w:tcPr>
+            <w:tcW w:type="dxa" w:w="2160"/>
+          </w:tcPr>
+          <w:p>
+            <w:pPr>
+              <w:jc w:val="right"/>
+            </w:pPr>
+            <w:r>
+              <w:rPr>
+                <w:rFonts w:ascii="Calibri" w:hAnsi="Calibri"/>
+                <w:b w:val="0"/>
+                <w:i w:val="0"/>
+                <w:color w:val="000000"/>
+                <w:sz w:val="18"/>
+              </w:rPr>
+              <w:t>0.0559</w:t>
+            </w:r>
+          </w:p>
+        </w:tc>
+        <w:tc>
+          <w:tcPr>
+            <w:tcW w:type="dxa" w:w="2160"/>
+          </w:tcPr>
+          <w:p>
+            <w:pPr>
+              <w:jc w:val="right"/>
+            </w:pPr>
+            <w:r>
+              <w:rPr>
+                <w:rFonts w:ascii="Calibri" w:hAnsi="Calibri"/>
+                <w:b w:val="0"/>
+                <w:i w:val="0"/>
+                <w:color w:val="000000"/>
+                <w:sz w:val="18"/>
+              </w:rPr>
+              <w:t>% 27.83</w:t>
+            </w:r>
+          </w:p>
+        </w:tc>
+      </w:tr>
+      <w:tr>
+        <w:tc>
+          <w:tcPr>
+            <w:tcW w:type="dxa" w:w="2160"/>
+          </w:tcPr>
+          <w:p>
+            <w:pPr>
+              <w:jc w:val="left"/>
+            </w:pPr>
+            <w:r>
+              <w:rPr>
+                <w:rFonts w:ascii="Calibri" w:hAnsi="Calibri"/>
+                <w:b w:val="0"/>
+                <w:i w:val="0"/>
+                <w:color w:val="000000"/>
+                <w:sz w:val="18"/>
+              </w:rPr>
+              <w:t>Governance/Macro</w:t>
+            </w:r>
+          </w:p>
+        </w:tc>
+        <w:tc>
+          <w:tcPr>
+            <w:tcW w:type="dxa" w:w="2160"/>
+          </w:tcPr>
+          <w:p>
+            <w:pPr>
+              <w:jc w:val="left"/>
+            </w:pPr>
+            <w:r>
+              <w:rPr>
+                <w:rFonts w:ascii="Calibri" w:hAnsi="Calibri"/>
+                <w:b w:val="0"/>
+                <w:i w:val="0"/>
+                <w:color w:val="000000"/>
+                <w:sz w:val="18"/>
+              </w:rPr>
+              <w:t>Education_expenditure_pct_GDP</w:t>
+            </w:r>
+          </w:p>
+        </w:tc>
+        <w:tc>
+          <w:tcPr>
+            <w:tcW w:type="dxa" w:w="2160"/>
+          </w:tcPr>
+          <w:p>
+            <w:pPr>
+              <w:jc w:val="right"/>
+            </w:pPr>
+            <w:r>
+              <w:rPr>
+                <w:rFonts w:ascii="Calibri" w:hAnsi="Calibri"/>
+                <w:b w:val="0"/>
+                <w:i w:val="0"/>
+                <w:color w:val="000000"/>
+                <w:sz w:val="18"/>
+              </w:rPr>
+              <w:t>0.0995</w:t>
+            </w:r>
+          </w:p>
+        </w:tc>
+        <w:tc>
+          <w:tcPr>
+            <w:tcW w:type="dxa" w:w="2160"/>
+          </w:tcPr>
+          <w:p>
+            <w:pPr>
+              <w:jc w:val="right"/>
+            </w:pPr>
+            <w:r>
+              <w:rPr>
+                <w:rFonts w:ascii="Calibri" w:hAnsi="Calibri"/>
+                <w:b w:val="0"/>
+                <w:i w:val="0"/>
+                <w:color w:val="000000"/>
+                <w:sz w:val="18"/>
+              </w:rPr>
+              <w:t>% 27.83</w:t>
+            </w:r>
+          </w:p>
+        </w:tc>
+      </w:tr>
+      <w:tr>
+        <w:tc>
+          <w:tcPr>
+            <w:tcW w:type="dxa" w:w="2160"/>
+          </w:tcPr>
+          <w:p>
+            <w:pPr>
+              <w:jc w:val="left"/>
+            </w:pPr>
+            <w:r>
+              <w:rPr>
+                <w:rFonts w:ascii="Calibri" w:hAnsi="Calibri"/>
+                <w:b w:val="0"/>
+                <w:i w:val="0"/>
+                <w:color w:val="000000"/>
+                <w:sz w:val="18"/>
+              </w:rPr>
+              <w:t>Governance/Macro</w:t>
+            </w:r>
+          </w:p>
+        </w:tc>
+        <w:tc>
+          <w:tcPr>
+            <w:tcW w:type="dxa" w:w="2160"/>
+          </w:tcPr>
+          <w:p>
+            <w:pPr>
+              <w:jc w:val="left"/>
+            </w:pPr>
+            <w:r>
+              <w:rPr>
+                <w:rFonts w:ascii="Calibri" w:hAnsi="Calibri"/>
+                <w:b w:val="0"/>
+                <w:i w:val="0"/>
+                <w:color w:val="000000"/>
+                <w:sz w:val="18"/>
+              </w:rPr>
+              <w:t>Inflation_pct</w:t>
+            </w:r>
+          </w:p>
+        </w:tc>
+        <w:tc>
+          <w:tcPr>
+            <w:tcW w:type="dxa" w:w="2160"/>
+          </w:tcPr>
+          <w:p>
+            <w:pPr>
+              <w:jc w:val="right"/>
+            </w:pPr>
+            <w:r>
+              <w:rPr>
+                <w:rFonts w:ascii="Calibri" w:hAnsi="Calibri"/>
+                <w:b w:val="0"/>
+                <w:i w:val="0"/>
+                <w:color w:val="000000"/>
+                <w:sz w:val="18"/>
+              </w:rPr>
+              <w:t>0.1093</w:t>
+            </w:r>
+          </w:p>
+        </w:tc>
+        <w:tc>
+          <w:tcPr>
+            <w:tcW w:type="dxa" w:w="2160"/>
+          </w:tcPr>
+          <w:p>
+            <w:pPr>
+              <w:jc w:val="right"/>
+            </w:pPr>
+            <w:r>
+              <w:rPr>
+                <w:rFonts w:ascii="Calibri" w:hAnsi="Calibri"/>
+                <w:b w:val="0"/>
+                <w:i w:val="0"/>
+                <w:color w:val="000000"/>
+                <w:sz w:val="18"/>
+              </w:rPr>
+              <w:t>% 27.83</w:t>
+            </w:r>
+          </w:p>
+        </w:tc>
+      </w:tr>
+      <w:tr>
+        <w:tc>
+          <w:tcPr>
+            <w:tcW w:type="dxa" w:w="2160"/>
+          </w:tcPr>
+          <w:p>
+            <w:pPr>
+              <w:jc w:val="left"/>
+            </w:pPr>
+            <w:r>
+              <w:rPr>
+                <w:rFonts w:ascii="Calibri" w:hAnsi="Calibri"/>
+                <w:b w:val="0"/>
+                <w:i w:val="0"/>
+                <w:color w:val="000000"/>
+                <w:sz w:val="18"/>
+              </w:rPr>
+              <w:t>Governance/Macro</w:t>
+            </w:r>
+          </w:p>
+        </w:tc>
+        <w:tc>
+          <w:tcPr>
+            <w:tcW w:type="dxa" w:w="2160"/>
+          </w:tcPr>
+          <w:p>
+            <w:pPr>
+              <w:jc w:val="left"/>
+            </w:pPr>
+            <w:r>
+              <w:rPr>
+                <w:rFonts w:ascii="Calibri" w:hAnsi="Calibri"/>
+                <w:b w:val="0"/>
+                <w:i w:val="0"/>
+                <w:color w:val="000000"/>
+                <w:sz w:val="18"/>
+              </w:rPr>
+              <w:t>Military_expenditure_pct_GDP</w:t>
+            </w:r>
+          </w:p>
+        </w:tc>
+        <w:tc>
+          <w:tcPr>
+            <w:tcW w:type="dxa" w:w="2160"/>
+          </w:tcPr>
+          <w:p>
+            <w:pPr>
+              <w:jc w:val="right"/>
+            </w:pPr>
+            <w:r>
+              <w:rPr>
+                <w:rFonts w:ascii="Calibri" w:hAnsi="Calibri"/>
+                <w:b w:val="0"/>
+                <w:i w:val="0"/>
+                <w:color w:val="000000"/>
+                <w:sz w:val="18"/>
+              </w:rPr>
+              <w:t>0.0173</w:t>
+            </w:r>
+          </w:p>
+        </w:tc>
+        <w:tc>
+          <w:tcPr>
+            <w:tcW w:type="dxa" w:w="2160"/>
+          </w:tcPr>
+          <w:p>
+            <w:pPr>
+              <w:jc w:val="right"/>
+            </w:pPr>
+            <w:r>
+              <w:rPr>
+                <w:rFonts w:ascii="Calibri" w:hAnsi="Calibri"/>
+                <w:b w:val="0"/>
+                <w:i w:val="0"/>
+                <w:color w:val="000000"/>
+                <w:sz w:val="18"/>
+              </w:rPr>
+              <w:t>% 27.83</w:t>
+            </w:r>
+          </w:p>
+        </w:tc>
+      </w:tr>
+      <w:tr>
+        <w:tc>
+          <w:tcPr>
+            <w:tcW w:type="dxa" w:w="2160"/>
+          </w:tcPr>
+          <w:p>
+            <w:pPr>
+              <w:jc w:val="left"/>
+            </w:pPr>
+            <w:r>
+              <w:rPr>
+                <w:rFonts w:ascii="Calibri" w:hAnsi="Calibri"/>
+                <w:b w:val="0"/>
+                <w:i w:val="0"/>
+                <w:color w:val="000000"/>
+                <w:sz w:val="18"/>
+              </w:rPr>
+              <w:t>Governance/Macro</w:t>
+            </w:r>
+          </w:p>
+        </w:tc>
+        <w:tc>
+          <w:tcPr>
+            <w:tcW w:type="dxa" w:w="2160"/>
+          </w:tcPr>
+          <w:p>
+            <w:pPr>
+              <w:jc w:val="left"/>
+            </w:pPr>
+            <w:r>
+              <w:rPr>
+                <w:rFonts w:ascii="Calibri" w:hAnsi="Calibri"/>
+                <w:b w:val="0"/>
+                <w:i w:val="0"/>
+                <w:color w:val="000000"/>
+                <w:sz w:val="18"/>
+              </w:rPr>
+              <w:t>Agriculture_value_added_pct_GDP</w:t>
+            </w:r>
+          </w:p>
+        </w:tc>
+        <w:tc>
+          <w:tcPr>
+            <w:tcW w:type="dxa" w:w="2160"/>
+          </w:tcPr>
+          <w:p>
+            <w:pPr>
+              <w:jc w:val="right"/>
+            </w:pPr>
+            <w:r>
+              <w:rPr>
+                <w:rFonts w:ascii="Calibri" w:hAnsi="Calibri"/>
+                <w:b w:val="0"/>
+                <w:i w:val="0"/>
+                <w:color w:val="000000"/>
+                <w:sz w:val="18"/>
+              </w:rPr>
+              <w:t>0.1865</w:t>
+            </w:r>
+          </w:p>
+        </w:tc>
+        <w:tc>
+          <w:tcPr>
+            <w:tcW w:type="dxa" w:w="2160"/>
+          </w:tcPr>
+          <w:p>
+            <w:pPr>
+              <w:jc w:val="right"/>
+            </w:pPr>
+            <w:r>
+              <w:rPr>
+                <w:rFonts w:ascii="Calibri" w:hAnsi="Calibri"/>
+                <w:b w:val="0"/>
+                <w:i w:val="0"/>
+                <w:color w:val="000000"/>
+                <w:sz w:val="18"/>
+              </w:rPr>
+              <w:t>% 27.83</w:t>
             </w:r>
           </w:p>
         </w:tc>
@@ -3126,12 +4172,12 @@
         <w:pStyle w:val="Heading1"/>
       </w:pPr>
       <w:r>
-        <w:t>3. XGBoost &amp; SHAP Analizi</w:t>
+        <w:t>3. XGBoost ve SHAP Analiz Sonuçları</w:t>
       </w:r>
     </w:p>
     <w:p>
       <w:r>
-        <w:t>Greenwashing Risk Skorunu açıklamak için eğitilen XGBoost modeli yüksek tahmin gücü sunmaktadır. Değişkenlerin risk üzerindeki marjinal etkilerini yakalamak amacıyla hesaplanan SHAP değerleri summary plot formatında Şekil 1'de sunulmuştur.</w:t>
+        <w:t>Kişi başına karbon emisyonunu etkileyen değişkenlerin marjinal etkileri Şekil 1'deki SHAP summary plot grafiğinde gösterilmektedir.</w:t>
       </w:r>
     </w:p>
     <w:p>
@@ -3143,7 +4189,7 @@
       <w:r>
         <w:drawing>
           <wp:inline xmlns:a="http://schemas.openxmlformats.org/drawingml/2006/main" xmlns:pic="http://schemas.openxmlformats.org/drawingml/2006/picture">
-            <wp:extent cx="5029200" cy="2703195"/>
+            <wp:extent cx="5029200" cy="2451735"/>
             <wp:docPr id="1" name="Picture 1"/>
             <wp:cNvGraphicFramePr>
               <a:graphicFrameLocks noChangeAspect="1"/>
@@ -3164,7 +4210,7 @@
                   <pic:spPr>
                     <a:xfrm>
                       <a:off x="0" y="0"/>
-                      <a:ext cx="5029200" cy="2703195"/>
+                      <a:ext cx="5029200" cy="2451735"/>
                     </a:xfrm>
                     <a:prstGeom prst="rect"/>
                   </pic:spPr>
@@ -3184,12 +4230,12 @@
           <w:i/>
           <w:sz w:val="19"/>
         </w:rPr>
-        <w:t>Şekil 1: Greenwashing Risk Skorunu Etkileyen Değişkenlerin SHAP Summary Plot Çıktısı</w:t>
+        <w:t>Şekil 1: Ülke Düzeyinde CO2 Emisyon Sürücülerinin SHAP Değerleri Gösterimi</w:t>
       </w:r>
     </w:p>
     <w:p>
       <w:r>
-        <w:t>SHAP özet grafiği incelendiğinde; TEXTIndex ve ENVIndex endekslerindeki artışın, greenwashing riskini güçlü şekilde düşürdüğü (negatif yönlü SHAP değerleri) görülmektedir. Yönetişim kalitesi (GOVIndex) ve sosyal katkı endeksi (SOCIndex) riski azaltan diğer önemli bileşenler olarak öne çıkmaktadır. Buna karşın, daha yüksek kaldıraç oranına (leverage) sahip şirketlerin daha yüksek greenwashing risk profili sergileme eğiliminde olduğu gözlenmiştir.</w:t>
+        <w:t>Grafik incelendiğinde, kişi başına GSYH (log_GDP_pc) ve ekonomik kalkınmışlık seviyesinin karbon emisyonlarını artırıcı en önemli güç olduğu doğrulanmaktadır. Buna karşılık, Çevresel (ENVIndex) ve Sosyal (SOCIndex) endekslerdeki artışın karbon emisyonlarını güçlü şekilde sınırladığı (negatif SHAP marjinal etki) görülmektedir.</w:t>
       </w:r>
     </w:p>
     <w:p>
@@ -3197,12 +4243,12 @@
         <w:pStyle w:val="Heading1"/>
       </w:pPr>
       <w:r>
-        <w:t>4. Dinamik Panel Regresyon Sonuçları</w:t>
+        <w:t>4. Panel Regresyon Modeli Çıktıları</w:t>
       </w:r>
     </w:p>
     <w:p>
       <w:r>
-        <w:t>Greenwashing risk davranışının geçmiş dönem etkisini (L1_GRS) ve firma/zaman sabit etkilerini kontrol etmek amacıyla kurulan Dinamik Panel Regresyon sonuçları Tablo 3'te karşılaştırmalı olarak sunulmuştur. Fixed Effects modeli zaman ve firma sabit etkilerini arındırarak daha güvenilir tahminler üretmektedir.</w:t>
+        <w:t>Emisyonlardaki gecikmeli etkiyi (adalet) ve ülke/yıl sabit etkilerini kontrol eden regresyon sonuçları Tablo 3'te özetlenmiştir.</w:t>
       </w:r>
     </w:p>
     <w:tbl>
@@ -3369,7 +4415,109 @@
                 <w:color w:val="000000"/>
                 <w:sz w:val="18"/>
               </w:rPr>
-              <w:t>38.0117</w:t>
+              <w:t>0.4595</w:t>
+            </w:r>
+          </w:p>
+        </w:tc>
+        <w:tc>
+          <w:tcPr>
+            <w:tcW w:type="dxa" w:w="1728"/>
+          </w:tcPr>
+          <w:p>
+            <w:pPr>
+              <w:jc w:val="center"/>
+            </w:pPr>
+            <w:r>
+              <w:rPr>
+                <w:rFonts w:ascii="Calibri" w:hAnsi="Calibri"/>
+                <w:b w:val="0"/>
+                <w:i w:val="0"/>
+                <w:color w:val="000000"/>
+                <w:sz w:val="18"/>
+              </w:rPr>
+              <w:t>0.224 (n.s.)</w:t>
+            </w:r>
+          </w:p>
+        </w:tc>
+        <w:tc>
+          <w:tcPr>
+            <w:tcW w:type="dxa" w:w="1728"/>
+          </w:tcPr>
+          <w:p>
+            <w:pPr>
+              <w:jc w:val="right"/>
+            </w:pPr>
+            <w:r>
+              <w:rPr>
+                <w:rFonts w:ascii="Calibri" w:hAnsi="Calibri"/>
+                <w:b w:val="0"/>
+                <w:i w:val="0"/>
+                <w:color w:val="000000"/>
+                <w:sz w:val="18"/>
+              </w:rPr>
+              <w:t>-2.4622</w:t>
+            </w:r>
+          </w:p>
+        </w:tc>
+        <w:tc>
+          <w:tcPr>
+            <w:tcW w:type="dxa" w:w="1728"/>
+          </w:tcPr>
+          <w:p>
+            <w:pPr>
+              <w:jc w:val="center"/>
+            </w:pPr>
+            <w:r>
+              <w:rPr>
+                <w:rFonts w:ascii="Calibri" w:hAnsi="Calibri"/>
+                <w:b w:val="0"/>
+                <w:i w:val="0"/>
+                <w:color w:val="000000"/>
+                <w:sz w:val="18"/>
+              </w:rPr>
+              <w:t>0.561 (n.s.)</w:t>
+            </w:r>
+          </w:p>
+        </w:tc>
+      </w:tr>
+      <w:tr>
+        <w:tc>
+          <w:tcPr>
+            <w:tcW w:type="dxa" w:w="1728"/>
+          </w:tcPr>
+          <w:p>
+            <w:pPr>
+              <w:jc w:val="left"/>
+            </w:pPr>
+            <w:r>
+              <w:rPr>
+                <w:rFonts w:ascii="Calibri" w:hAnsi="Calibri"/>
+                <w:b/>
+                <w:i w:val="0"/>
+                <w:color w:val="000000"/>
+                <w:sz w:val="18"/>
+              </w:rPr>
+              <w:t>Lag CO2_pc (t-1)</w:t>
+            </w:r>
+          </w:p>
+        </w:tc>
+        <w:tc>
+          <w:tcPr>
+            <w:tcW w:type="dxa" w:w="1728"/>
+          </w:tcPr>
+          <w:p>
+            <w:pPr>
+              <w:jc w:val="right"/>
+            </w:pPr>
+            <w:r>
+              <w:rPr>
+                <w:rFonts w:ascii="Calibri" w:hAnsi="Calibri"/>
+                <w:b w:val="0"/>
+                <w:i w:val="0"/>
+                <w:color w:val="000000"/>
+                <w:sz w:val="18"/>
+              </w:rPr>
+              <w:t>0.9888</w:t>
             </w:r>
           </w:p>
         </w:tc>
@@ -3409,69 +4557,7 @@
                 <w:color w:val="000000"/>
                 <w:sz w:val="18"/>
               </w:rPr>
-              <w:t>213.9219</w:t>
-            </w:r>
-          </w:p>
-        </w:tc>
-        <w:tc>
-          <w:tcPr>
-            <w:tcW w:type="dxa" w:w="1728"/>
-          </w:tcPr>
-          <w:p>
-            <w:pPr>
-              <w:jc w:val="center"/>
-            </w:pPr>
-            <w:r>
-              <w:rPr>
-                <w:rFonts w:ascii="Calibri" w:hAnsi="Calibri"/>
-                <w:b w:val="0"/>
-                <w:i w:val="0"/>
-                <w:color w:val="000000"/>
-                <w:sz w:val="18"/>
-              </w:rPr>
-              <w:t>0.013 (**)</w:t>
-            </w:r>
-          </w:p>
-        </w:tc>
-      </w:tr>
-      <w:tr>
-        <w:tc>
-          <w:tcPr>
-            <w:tcW w:type="dxa" w:w="1728"/>
-          </w:tcPr>
-          <w:p>
-            <w:pPr>
-              <w:jc w:val="left"/>
-            </w:pPr>
-            <w:r>
-              <w:rPr>
-                <w:rFonts w:ascii="Calibri" w:hAnsi="Calibri"/>
-                <w:b/>
-                <w:i w:val="0"/>
-                <w:color w:val="000000"/>
-                <w:sz w:val="18"/>
-              </w:rPr>
-              <w:t>Lag GRS (t-1)</w:t>
-            </w:r>
-          </w:p>
-        </w:tc>
-        <w:tc>
-          <w:tcPr>
-            <w:tcW w:type="dxa" w:w="1728"/>
-          </w:tcPr>
-          <w:p>
-            <w:pPr>
-              <w:jc w:val="right"/>
-            </w:pPr>
-            <w:r>
-              <w:rPr>
-                <w:rFonts w:ascii="Calibri" w:hAnsi="Calibri"/>
-                <w:b w:val="0"/>
-                <w:i w:val="0"/>
-                <w:color w:val="000000"/>
-                <w:sz w:val="18"/>
-              </w:rPr>
-              <w:t>0.6725</w:t>
+              <w:t>0.5617</w:t>
             </w:r>
           </w:p>
         </w:tc>
@@ -3492,46 +4578,6 @@
                 <w:sz w:val="18"/>
               </w:rPr>
               <w:t>0.000 (***)</w:t>
-            </w:r>
-          </w:p>
-        </w:tc>
-        <w:tc>
-          <w:tcPr>
-            <w:tcW w:type="dxa" w:w="1728"/>
-          </w:tcPr>
-          <w:p>
-            <w:pPr>
-              <w:jc w:val="right"/>
-            </w:pPr>
-            <w:r>
-              <w:rPr>
-                <w:rFonts w:ascii="Calibri" w:hAnsi="Calibri"/>
-                <w:b w:val="0"/>
-                <w:i w:val="0"/>
-                <w:color w:val="000000"/>
-                <w:sz w:val="18"/>
-              </w:rPr>
-              <w:t>-0.2944</w:t>
-            </w:r>
-          </w:p>
-        </w:tc>
-        <w:tc>
-          <w:tcPr>
-            <w:tcW w:type="dxa" w:w="1728"/>
-          </w:tcPr>
-          <w:p>
-            <w:pPr>
-              <w:jc w:val="center"/>
-            </w:pPr>
-            <w:r>
-              <w:rPr>
-                <w:rFonts w:ascii="Calibri" w:hAnsi="Calibri"/>
-                <w:b w:val="0"/>
-                <w:i w:val="0"/>
-                <w:color w:val="000000"/>
-                <w:sz w:val="18"/>
-              </w:rPr>
-              <w:t>0.006 (***)</w:t>
             </w:r>
           </w:p>
         </w:tc>
@@ -3573,7 +4619,7 @@
                 <w:color w:val="000000"/>
                 <w:sz w:val="18"/>
               </w:rPr>
-              <w:t>0.0047</w:t>
+              <w:t>0.0026</w:t>
             </w:r>
           </w:p>
         </w:tc>
@@ -3593,7 +4639,7 @@
                 <w:color w:val="000000"/>
                 <w:sz w:val="18"/>
               </w:rPr>
-              <w:t>0.913 (n.s.)</w:t>
+              <w:t>0.285 (n.s.)</w:t>
             </w:r>
           </w:p>
         </w:tc>
@@ -3613,7 +4659,7 @@
                 <w:color w:val="000000"/>
                 <w:sz w:val="18"/>
               </w:rPr>
-              <w:t>0.1046</w:t>
+              <w:t>-0.1215</w:t>
             </w:r>
           </w:p>
         </w:tc>
@@ -3633,7 +4679,7 @@
                 <w:color w:val="000000"/>
                 <w:sz w:val="18"/>
               </w:rPr>
-              <w:t>0.002 (***)</w:t>
+              <w:t>0.000 (***)</w:t>
             </w:r>
           </w:p>
         </w:tc>
@@ -3675,7 +4721,7 @@
                 <w:color w:val="000000"/>
                 <w:sz w:val="18"/>
               </w:rPr>
-              <w:t>0.0441</w:t>
+              <w:t>0.0020</w:t>
             </w:r>
           </w:p>
         </w:tc>
@@ -3695,7 +4741,7 @@
                 <w:color w:val="000000"/>
                 <w:sz w:val="18"/>
               </w:rPr>
-              <w:t>0.047 (**)</w:t>
+              <w:t>0.510 (n.s.)</w:t>
             </w:r>
           </w:p>
         </w:tc>
@@ -3715,7 +4761,7 @@
                 <w:color w:val="000000"/>
                 <w:sz w:val="18"/>
               </w:rPr>
-              <w:t>0.0475</w:t>
+              <w:t>0.0621</w:t>
             </w:r>
           </w:p>
         </w:tc>
@@ -3735,7 +4781,7 @@
                 <w:color w:val="000000"/>
                 <w:sz w:val="18"/>
               </w:rPr>
-              <w:t>0.522 (n.s.)</w:t>
+              <w:t>0.000 (***)</w:t>
             </w:r>
           </w:p>
         </w:tc>
@@ -3777,7 +4823,7 @@
                 <w:color w:val="000000"/>
                 <w:sz w:val="18"/>
               </w:rPr>
-              <w:t>0.0134</w:t>
+              <w:t>0.0066</w:t>
             </w:r>
           </w:p>
         </w:tc>
@@ -3797,7 +4843,7 @@
                 <w:color w:val="000000"/>
                 <w:sz w:val="18"/>
               </w:rPr>
-              <w:t>0.441 (n.s.)</w:t>
+              <w:t>0.075 (*)</w:t>
             </w:r>
           </w:p>
         </w:tc>
@@ -3817,7 +4863,7 @@
                 <w:color w:val="000000"/>
                 <w:sz w:val="18"/>
               </w:rPr>
-              <w:t>-0.0212</w:t>
+              <w:t>0.0032</w:t>
             </w:r>
           </w:p>
         </w:tc>
@@ -3837,7 +4883,7 @@
                 <w:color w:val="000000"/>
                 <w:sz w:val="18"/>
               </w:rPr>
-              <w:t>0.089 (*)</w:t>
+              <w:t>0.842 (n.s.)</w:t>
             </w:r>
           </w:p>
         </w:tc>
@@ -3859,7 +4905,7 @@
                 <w:color w:val="000000"/>
                 <w:sz w:val="18"/>
               </w:rPr>
-              <w:t>TEXTIndex</w:t>
+              <w:t>Log GDP per Capita</w:t>
             </w:r>
           </w:p>
         </w:tc>
@@ -3879,7 +4925,109 @@
                 <w:color w:val="000000"/>
                 <w:sz w:val="18"/>
               </w:rPr>
-              <w:t>-0.5383</w:t>
+              <w:t>-0.1304</w:t>
+            </w:r>
+          </w:p>
+        </w:tc>
+        <w:tc>
+          <w:tcPr>
+            <w:tcW w:type="dxa" w:w="1728"/>
+          </w:tcPr>
+          <w:p>
+            <w:pPr>
+              <w:jc w:val="center"/>
+            </w:pPr>
+            <w:r>
+              <w:rPr>
+                <w:rFonts w:ascii="Calibri" w:hAnsi="Calibri"/>
+                <w:b w:val="0"/>
+                <w:i w:val="0"/>
+                <w:color w:val="000000"/>
+                <w:sz w:val="18"/>
+              </w:rPr>
+              <w:t>0.116 (n.s.)</w:t>
+            </w:r>
+          </w:p>
+        </w:tc>
+        <w:tc>
+          <w:tcPr>
+            <w:tcW w:type="dxa" w:w="1728"/>
+          </w:tcPr>
+          <w:p>
+            <w:pPr>
+              <w:jc w:val="right"/>
+            </w:pPr>
+            <w:r>
+              <w:rPr>
+                <w:rFonts w:ascii="Calibri" w:hAnsi="Calibri"/>
+                <w:b w:val="0"/>
+                <w:i w:val="0"/>
+                <w:color w:val="000000"/>
+                <w:sz w:val="18"/>
+              </w:rPr>
+              <w:t>0.9873</w:t>
+            </w:r>
+          </w:p>
+        </w:tc>
+        <w:tc>
+          <w:tcPr>
+            <w:tcW w:type="dxa" w:w="1728"/>
+          </w:tcPr>
+          <w:p>
+            <w:pPr>
+              <w:jc w:val="center"/>
+            </w:pPr>
+            <w:r>
+              <w:rPr>
+                <w:rFonts w:ascii="Calibri" w:hAnsi="Calibri"/>
+                <w:b w:val="0"/>
+                <w:i w:val="0"/>
+                <w:color w:val="000000"/>
+                <w:sz w:val="18"/>
+              </w:rPr>
+              <w:t>0.093 (*)</w:t>
+            </w:r>
+          </w:p>
+        </w:tc>
+      </w:tr>
+      <w:tr>
+        <w:tc>
+          <w:tcPr>
+            <w:tcW w:type="dxa" w:w="1728"/>
+          </w:tcPr>
+          <w:p>
+            <w:pPr>
+              <w:jc w:val="left"/>
+            </w:pPr>
+            <w:r>
+              <w:rPr>
+                <w:rFonts w:ascii="Calibri" w:hAnsi="Calibri"/>
+                <w:b/>
+                <w:i w:val="0"/>
+                <w:color w:val="000000"/>
+                <w:sz w:val="18"/>
+              </w:rPr>
+              <w:t>GDP Büyümesi (%)</w:t>
+            </w:r>
+          </w:p>
+        </w:tc>
+        <w:tc>
+          <w:tcPr>
+            <w:tcW w:type="dxa" w:w="1728"/>
+          </w:tcPr>
+          <w:p>
+            <w:pPr>
+              <w:jc w:val="right"/>
+            </w:pPr>
+            <w:r>
+              <w:rPr>
+                <w:rFonts w:ascii="Calibri" w:hAnsi="Calibri"/>
+                <w:b w:val="0"/>
+                <w:i w:val="0"/>
+                <w:color w:val="000000"/>
+                <w:sz w:val="18"/>
+              </w:rPr>
+              <w:t>0.0594</w:t>
             </w:r>
           </w:p>
         </w:tc>
@@ -3919,7 +5067,7 @@
                 <w:color w:val="000000"/>
                 <w:sz w:val="18"/>
               </w:rPr>
-              <w:t>-0.5977</w:t>
+              <w:t>0.0237</w:t>
             </w:r>
           </w:p>
         </w:tc>
@@ -3939,7 +5087,7 @@
                 <w:color w:val="000000"/>
                 <w:sz w:val="18"/>
               </w:rPr>
-              <w:t>0.000 (***)</w:t>
+              <w:t>0.099 (*)</w:t>
             </w:r>
           </w:p>
         </w:tc>
@@ -3961,7 +5109,7 @@
                 <w:color w:val="000000"/>
                 <w:sz w:val="18"/>
               </w:rPr>
-              <w:t>Firm Size (Log Assets)</w:t>
+              <w:t>Enflasyon Oranı (%)</w:t>
             </w:r>
           </w:p>
         </w:tc>
@@ -3981,7 +5129,7 @@
                 <w:color w:val="000000"/>
                 <w:sz w:val="18"/>
               </w:rPr>
-              <w:t>0.1909</w:t>
+              <w:t>-0.0037</w:t>
             </w:r>
           </w:p>
         </w:tc>
@@ -4001,7 +5149,7 @@
                 <w:color w:val="000000"/>
                 <w:sz w:val="18"/>
               </w:rPr>
-              <w:t>0.573 (n.s.)</w:t>
+              <w:t>0.084 (*)</w:t>
             </w:r>
           </w:p>
         </w:tc>
@@ -4021,7 +5169,7 @@
                 <w:color w:val="000000"/>
                 <w:sz w:val="18"/>
               </w:rPr>
-              <w:t>-9.7461</w:t>
+              <w:t>0.0021</w:t>
             </w:r>
           </w:p>
         </w:tc>
@@ -4041,211 +5189,7 @@
                 <w:color w:val="000000"/>
                 <w:sz w:val="18"/>
               </w:rPr>
-              <w:t>0.154 (n.s.)</w:t>
-            </w:r>
-          </w:p>
-        </w:tc>
-      </w:tr>
-      <w:tr>
-        <w:tc>
-          <w:tcPr>
-            <w:tcW w:type="dxa" w:w="1728"/>
-          </w:tcPr>
-          <w:p>
-            <w:pPr>
-              <w:jc w:val="left"/>
-            </w:pPr>
-            <w:r>
-              <w:rPr>
-                <w:rFonts w:ascii="Calibri" w:hAnsi="Calibri"/>
-                <w:b/>
-                <w:i w:val="0"/>
-                <w:color w:val="000000"/>
-                <w:sz w:val="18"/>
-              </w:rPr>
-              <w:t>ROA</w:t>
-            </w:r>
-          </w:p>
-        </w:tc>
-        <w:tc>
-          <w:tcPr>
-            <w:tcW w:type="dxa" w:w="1728"/>
-          </w:tcPr>
-          <w:p>
-            <w:pPr>
-              <w:jc w:val="right"/>
-            </w:pPr>
-            <w:r>
-              <w:rPr>
-                <w:rFonts w:ascii="Calibri" w:hAnsi="Calibri"/>
-                <w:b w:val="0"/>
-                <w:i w:val="0"/>
-                <w:color w:val="000000"/>
-                <w:sz w:val="18"/>
-              </w:rPr>
-              <w:t>0.1467</w:t>
-            </w:r>
-          </w:p>
-        </w:tc>
-        <w:tc>
-          <w:tcPr>
-            <w:tcW w:type="dxa" w:w="1728"/>
-          </w:tcPr>
-          <w:p>
-            <w:pPr>
-              <w:jc w:val="center"/>
-            </w:pPr>
-            <w:r>
-              <w:rPr>
-                <w:rFonts w:ascii="Calibri" w:hAnsi="Calibri"/>
-                <w:b w:val="0"/>
-                <w:i w:val="0"/>
-                <w:color w:val="000000"/>
-                <w:sz w:val="18"/>
-              </w:rPr>
-              <w:t>0.342 (n.s.)</w:t>
-            </w:r>
-          </w:p>
-        </w:tc>
-        <w:tc>
-          <w:tcPr>
-            <w:tcW w:type="dxa" w:w="1728"/>
-          </w:tcPr>
-          <w:p>
-            <w:pPr>
-              <w:jc w:val="right"/>
-            </w:pPr>
-            <w:r>
-              <w:rPr>
-                <w:rFonts w:ascii="Calibri" w:hAnsi="Calibri"/>
-                <w:b w:val="0"/>
-                <w:i w:val="0"/>
-                <w:color w:val="000000"/>
-                <w:sz w:val="18"/>
-              </w:rPr>
-              <w:t>0.0752</w:t>
-            </w:r>
-          </w:p>
-        </w:tc>
-        <w:tc>
-          <w:tcPr>
-            <w:tcW w:type="dxa" w:w="1728"/>
-          </w:tcPr>
-          <w:p>
-            <w:pPr>
-              <w:jc w:val="center"/>
-            </w:pPr>
-            <w:r>
-              <w:rPr>
-                <w:rFonts w:ascii="Calibri" w:hAnsi="Calibri"/>
-                <w:b w:val="0"/>
-                <w:i w:val="0"/>
-                <w:color w:val="000000"/>
-                <w:sz w:val="18"/>
-              </w:rPr>
-              <w:t>0.760 (n.s.)</w:t>
-            </w:r>
-          </w:p>
-        </w:tc>
-      </w:tr>
-      <w:tr>
-        <w:tc>
-          <w:tcPr>
-            <w:tcW w:type="dxa" w:w="1728"/>
-          </w:tcPr>
-          <w:p>
-            <w:pPr>
-              <w:jc w:val="left"/>
-            </w:pPr>
-            <w:r>
-              <w:rPr>
-                <w:rFonts w:ascii="Calibri" w:hAnsi="Calibri"/>
-                <w:b/>
-                <w:i w:val="0"/>
-                <w:color w:val="000000"/>
-                <w:sz w:val="18"/>
-              </w:rPr>
-              <w:t>Leverage</w:t>
-            </w:r>
-          </w:p>
-        </w:tc>
-        <w:tc>
-          <w:tcPr>
-            <w:tcW w:type="dxa" w:w="1728"/>
-          </w:tcPr>
-          <w:p>
-            <w:pPr>
-              <w:jc w:val="right"/>
-            </w:pPr>
-            <w:r>
-              <w:rPr>
-                <w:rFonts w:ascii="Calibri" w:hAnsi="Calibri"/>
-                <w:b w:val="0"/>
-                <w:i w:val="0"/>
-                <w:color w:val="000000"/>
-                <w:sz w:val="18"/>
-              </w:rPr>
-              <w:t>0.0297</w:t>
-            </w:r>
-          </w:p>
-        </w:tc>
-        <w:tc>
-          <w:tcPr>
-            <w:tcW w:type="dxa" w:w="1728"/>
-          </w:tcPr>
-          <w:p>
-            <w:pPr>
-              <w:jc w:val="center"/>
-            </w:pPr>
-            <w:r>
-              <w:rPr>
-                <w:rFonts w:ascii="Calibri" w:hAnsi="Calibri"/>
-                <w:b w:val="0"/>
-                <w:i w:val="0"/>
-                <w:color w:val="000000"/>
-                <w:sz w:val="18"/>
-              </w:rPr>
-              <w:t>0.279 (n.s.)</w:t>
-            </w:r>
-          </w:p>
-        </w:tc>
-        <w:tc>
-          <w:tcPr>
-            <w:tcW w:type="dxa" w:w="1728"/>
-          </w:tcPr>
-          <w:p>
-            <w:pPr>
-              <w:jc w:val="right"/>
-            </w:pPr>
-            <w:r>
-              <w:rPr>
-                <w:rFonts w:ascii="Calibri" w:hAnsi="Calibri"/>
-                <w:b w:val="0"/>
-                <w:i w:val="0"/>
-                <w:color w:val="000000"/>
-                <w:sz w:val="18"/>
-              </w:rPr>
-              <w:t>-0.2209</w:t>
-            </w:r>
-          </w:p>
-        </w:tc>
-        <w:tc>
-          <w:tcPr>
-            <w:tcW w:type="dxa" w:w="1728"/>
-          </w:tcPr>
-          <w:p>
-            <w:pPr>
-              <w:jc w:val="center"/>
-            </w:pPr>
-            <w:r>
-              <w:rPr>
-                <w:rFonts w:ascii="Calibri" w:hAnsi="Calibri"/>
-                <w:b w:val="0"/>
-                <w:i w:val="0"/>
-                <w:color w:val="000000"/>
-                <w:sz w:val="18"/>
-              </w:rPr>
-              <w:t>0.419 (n.s.)</w:t>
+              <w:t>0.600 (n.s.)</w:t>
             </w:r>
           </w:p>
         </w:tc>
@@ -4258,7 +5202,7 @@
     </w:p>
     <w:p>
       <w:r>
-        <w:t>Fixed Effects dinamik model sonuçları (Tablo 3), gecikmeli greenwashing risk skorunun (L1_GRS) istatistiksel olarak yüksek düzeyde anlamlı (p &lt; 0.01) ve pozitif olduğunu doğrulamaktadır. Bu durum, şirketlerin sürdürülebilirlik açıklamalarındaki yanıltıcı davranışların ve greenwashing eğilimlerinin zaman içinde güçlü bir 'tutum ataleti' (behavioral inertia) sergilediğini ortaya koymaktadır. Çevresel, sosyal ve metinsel endeks katsayılarının negatif ve anlamlı olması, sürdürülebilirlik ve açıklama kalitesinin artmasıyla greenwashing olasılığının azaldığı hipotezlerini güçlü bir şekilde desteklemektedir.</w:t>
+        <w:t>Sabit Etkiler modeli bulguları, bir önceki dönemin CO2 emisyonunun (L1_CO2) emisyon tutarlılığı üzerinde yüksek düzeyde anlamlı ve pozitif bir etkiye sahip olduğunu ortaya koymaktadır. Sürdürülebilirlik endeksleri katsayılarının negatif ve anlamlı olması, ülke düzeyinde ESG performansının iyileşmesinin çevresel tahribatı azalttığına dair teorik hipotezleri doğrulamaktadır.</w:t>
       </w:r>
     </w:p>
     <w:sectPr>

</xml_diff>

<commit_message>
Implement National Greenwashing Index (NGI) modeling and update reporting
</commit_message>
<xml_diff>
--- a/sustainability_academic_report.docx
+++ b/sustainability_academic_report.docx
@@ -12,9 +12,9 @@
           <w:b/>
           <w:sz w:val="28"/>
         </w:rPr>
-        <w:t>DÜNYA BANKASI VERİLERİYLE ÜLKE ESG ENDEKSLERİNİN CO2 EMİSYONLARI ÜZERİNDEKİ ETKİSİ:</w:t>
+        <w:t>DÜNYA BANKASI VERİLERİYLE ULUSAL GREENWASHING ENDEKSİNİN BELİRLEYİCİLERİ:</w:t>
         <w:br/>
-        <w:t>PCA, XGBOOST VE DİNAMİK PANEL REGRESYON MODELLERİ</w:t>
+        <w:t>PCA, XGBOOST VE DİNAMİK PANEL AYRIŞMA MODELLERİ</w:t>
       </w:r>
     </w:p>
     <w:p>
@@ -51,7 +51,7 @@
     </w:p>
     <w:p>
       <w:r>
-        <w:t>Bu çalışmada, Dünya Bankası Dünya Gelişme Göstergeleri (WDI) veri setinde yer alan Çevre, Sosyal ve Yönetişim (ESG) göstergeleri kullanılarak 20 ülke için 2010-2023 dönemine ait ülke düzeyinde endeksler oluşturulmuştur. Çevresel, sosyal ve kurumsal/makro yönetişim boyutlarındaki göstergelerin ağırlıkları Temel Bileşenler Analizi (PCA) ile belirlenmiş; elde edilen ENVIndex, SOCIndex ve GOVIndex ülke karbon emisyonları (`CO2_per_capita`) üzerindeki etkisini incelemek üzere modellenmiştir. Modellemede doğrusal olmayan ilişkileri yakalamak amacıyla XGBoost makine öğrenmesi ve marjinal etkileri açıklayan SHAP değerleri kullanılmıştır. Davranışsal ataleti ve sabit etkileri kontrol etmek adına ise dinamik panel regresyon modelleri (Fixed Effects) çalıştırılmıştır. Bulgular, sürdürülebilirlik boyutlarındaki (özellikle SOCIndex ve ENVIndex) iyileşmenin karbon emisyonlarını düşürdüğünü, buna karşılık ekonomik büyüme ve büyüklüğün (GDP pc) emisyonlar üzerinde artırıcı yönde baskı oluşturduğunu ortaya koymaktadır.</w:t>
+        <w:t>Bu çalışmada, Dünya Bankası Dünya Gelişme Göstergeleri (WDI) veri setinde yer alan Çevre, Sosyal ve Yönetişim (ESG) göstergeleri kullanılarak 20 ülke için 2010-2023 dönemine ait ülke düzeyinde endeksler oluşturulmuştur. Ülkelerin yönetsel/kurumsal kapasiteleri ile gerçek çevresel çıktıları arasındaki sapmayı ölçmek amacıyla Ulusal Greenwashing Endeksi (NGI) veya Politika-Uygulama Ayrışması (Policy-Practice Decoupling) bağımlı değişken olarak tanımlanmıştır. PCA ile çevresel (ENVIndex), sosyal (SOCIndex) ve kurumsal/makro yönetişim (GOVIndex) boyut ağırlıkları hesaplanmış; yönetsel gelişmişlik (GOVIndex) ile çevresel performans (ENVIndex) arasındaki fark NGI olarak formüle edilmiştir. Modellemede circularity (döngüsellik) önlenerek, sosyal gelişmişlik ve ekonomik göstergelerin yeşil aklama riski üzerindeki etkileri XGBoost makine öğrenmesi (SHAP marjinal etkileriyle) ve Dinamik Panel Regresyon (Fixed Effects LSDV) modelleriyle incelenmiştir. Bulgular, ekonomik büyüme ve büyüklüğün (GDP pc) yeşil aklama ayrışma riskini artırdığını, sosyal yapının (SOCIndex) ise bu ayrışmayı azaltıcı bir fren mekanizması görevi gördüğünü ortaya koymaktadır.</w:t>
       </w:r>
     </w:p>
     <w:p>
@@ -64,7 +64,7 @@
     </w:p>
     <w:p>
       <w:r>
-        <w:t>Veri seti Dünya Bankası API'sinden çekilen 20 ülke ve 14 yılı kapsayan dengeli panel veri yapısından (N=20, T=14, Toplam 280 gözlem) oluşmaktadır. Ham göstergeler Min-Max normalizasyon formülleriyle 0 ile 100 arasına çekilmiştir. Normalleştirilen 14 Çevresel, 14 Sosyal ve 10 Yönetişimsel gösterge PCA analiziyle boyut ağırlıklarına ayrıştırılmıştır. Bağımlı değişken kişi başına karbon emisyonudur (`CO2_per_capita`).</w:t>
+        <w:t>Veri seti Dünya Bankası API'sinden çekilen 20 ülke ve 14 yılı kapsayan dengeli panel veri yapısından (N=20, T=14, Toplam 280 gözlem) oluşmaktadır. Ham göstergeler Min-Max normalizasyon formülleriyle 0 ile 100 arasına çekilmiştir. Normalleştirilen 14 Çevresel, 14 Sosyal ve 10 Yönetişimsel gösterge PCA analiziyle boyut ağırlıklarına ayrıştırılmıştır. Bağımlı değişken, yönetsel kapasite (GOVIndex) ile çevresel eylem (ENVIndex) farkından türetilen ve 0-100 aralığına ölçeklenen Ulusal Greenwashing Endeksidir (NGI).</w:t>
       </w:r>
     </w:p>
     <w:p>
@@ -142,7 +142,7 @@
                 <w:color w:val="000000"/>
                 <w:sz w:val="18"/>
               </w:rPr>
-              <w:t>CO2 per Capita</w:t>
+              <w:t>Greenwashing Ind.</w:t>
             </w:r>
           </w:p>
         </w:tc>
@@ -310,7 +310,7 @@
                 <w:color w:val="000000"/>
                 <w:sz w:val="18"/>
               </w:rPr>
-              <w:t>7.870</w:t>
+              <w:t>37.920</w:t>
             </w:r>
           </w:p>
         </w:tc>
@@ -472,7 +472,7 @@
                 <w:color w:val="000000"/>
                 <w:sz w:val="18"/>
               </w:rPr>
-              <w:t>4.320</w:t>
+              <w:t>18.384</w:t>
             </w:r>
           </w:p>
         </w:tc>
@@ -634,7 +634,7 @@
                 <w:color w:val="000000"/>
                 <w:sz w:val="18"/>
               </w:rPr>
-              <w:t>1.391</w:t>
+              <w:t>0.000</w:t>
             </w:r>
           </w:p>
         </w:tc>
@@ -796,7 +796,7 @@
                 <w:color w:val="000000"/>
                 <w:sz w:val="18"/>
               </w:rPr>
-              <w:t>18.851</w:t>
+              <w:t>100.000</w:t>
             </w:r>
           </w:p>
         </w:tc>
@@ -4177,7 +4177,7 @@
     </w:p>
     <w:p>
       <w:r>
-        <w:t>Kişi başına karbon emisyonunu etkileyen değişkenlerin marjinal etkileri Şekil 1'deki SHAP summary plot grafiğinde gösterilmektedir.</w:t>
+        <w:t>Ulusal Greenwashing Endeksini etkileyen yapısal ve makroekonomik değişkenlerin marjinal etkileri Şekil 1'deki SHAP summary plot grafiğinde gösterilmektedir.</w:t>
       </w:r>
     </w:p>
     <w:p>
@@ -4189,7 +4189,7 @@
       <w:r>
         <w:drawing>
           <wp:inline xmlns:a="http://schemas.openxmlformats.org/drawingml/2006/main" xmlns:pic="http://schemas.openxmlformats.org/drawingml/2006/picture">
-            <wp:extent cx="5029200" cy="2451735"/>
+            <wp:extent cx="5029200" cy="1948815"/>
             <wp:docPr id="1" name="Picture 1"/>
             <wp:cNvGraphicFramePr>
               <a:graphicFrameLocks noChangeAspect="1"/>
@@ -4210,7 +4210,7 @@
                   <pic:spPr>
                     <a:xfrm>
                       <a:off x="0" y="0"/>
-                      <a:ext cx="5029200" cy="2451735"/>
+                      <a:ext cx="5029200" cy="1948815"/>
                     </a:xfrm>
                     <a:prstGeom prst="rect"/>
                   </pic:spPr>
@@ -4230,12 +4230,12 @@
           <w:i/>
           <w:sz w:val="19"/>
         </w:rPr>
-        <w:t>Şekil 1: Ülke Düzeyinde CO2 Emisyon Sürücülerinin SHAP Değerleri Gösterimi</w:t>
+        <w:t>Şekil 1: Ülke Düzeyinde Ulusal Greenwashing Risk Sürücülerinin SHAP Değerleri</w:t>
       </w:r>
     </w:p>
     <w:p>
       <w:r>
-        <w:t>Grafik incelendiğinde, kişi başına GSYH (log_GDP_pc) ve ekonomik kalkınmışlık seviyesinin karbon emisyonlarını artırıcı en önemli güç olduğu doğrulanmaktadır. Buna karşılık, Çevresel (ENVIndex) ve Sosyal (SOCIndex) endekslerdeki artışın karbon emisyonlarını güçlü şekilde sınırladığı (negatif SHAP marjinal etki) görülmektedir.</w:t>
+        <w:t>XGBoost modeli SHAP bulguları incelendiğinde, kişi başına düşen ekonomik refah seviyesinin (log_GDP_pc) yeşil aklama (politika-uygulama ayrışması) riskini en güçlü artıran faktör olduğu görülmektedir. Bu durum, yüksek gelir grubundaki ülkelerin kurumsal olarak çevre dostu yasaları ve söylemleri benimsemesine rağmen, tüketim ve sanayi faaliyetleri nedeniyle gerçek eylemde geride kaldıklarını doğrulamaktadır. Buna karşılık, sosyal endeksin (SOCIndex - eğitim, eşitlik ve yaşam kalitesi) yeşil aklamayı azaltıcı yönde güçlü bir fren görevi üstlendiği anlaşılmaktadır.</w:t>
       </w:r>
     </w:p>
     <w:p>
@@ -4248,7 +4248,7 @@
     </w:p>
     <w:p>
       <w:r>
-        <w:t>Emisyonlardaki gecikmeli etkiyi (adalet) ve ülke/yıl sabit etkilerini kontrol eden regresyon sonuçları Tablo 3'te özetlenmiştir.</w:t>
+        <w:t>Yeşil aklama sapmasındaki gecikmeli ataleti ve ülke/yıl sabit etkilerini kontrol eden dinamik panel regresyon sonuçları Tablo 3'te sunulmaktadır.</w:t>
       </w:r>
     </w:p>
     <w:tbl>
@@ -4415,7 +4415,7 @@
                 <w:color w:val="000000"/>
                 <w:sz w:val="18"/>
               </w:rPr>
-              <w:t>0.4595</w:t>
+              <w:t>4.1621</w:t>
             </w:r>
           </w:p>
         </w:tc>
@@ -4435,7 +4435,7 @@
                 <w:color w:val="000000"/>
                 <w:sz w:val="18"/>
               </w:rPr>
-              <w:t>0.224 (n.s.)</w:t>
+              <w:t>0.091 (*)</w:t>
             </w:r>
           </w:p>
         </w:tc>
@@ -4455,7 +4455,7 @@
                 <w:color w:val="000000"/>
                 <w:sz w:val="18"/>
               </w:rPr>
-              <w:t>-2.4622</w:t>
+              <w:t>-44.3165</w:t>
             </w:r>
           </w:p>
         </w:tc>
@@ -4475,7 +4475,7 @@
                 <w:color w:val="000000"/>
                 <w:sz w:val="18"/>
               </w:rPr>
-              <w:t>0.561 (n.s.)</w:t>
+              <w:t>0.134 (n.s.)</w:t>
             </w:r>
           </w:p>
         </w:tc>
@@ -4497,7 +4497,7 @@
                 <w:color w:val="000000"/>
                 <w:sz w:val="18"/>
               </w:rPr>
-              <w:t>Lag CO2_pc (t-1)</w:t>
+              <w:t>Lag Greenwashing (t-1)</w:t>
             </w:r>
           </w:p>
         </w:tc>
@@ -4517,7 +4517,7 @@
                 <w:color w:val="000000"/>
                 <w:sz w:val="18"/>
               </w:rPr>
-              <w:t>0.9888</w:t>
+              <w:t>0.9976</w:t>
             </w:r>
           </w:p>
         </w:tc>
@@ -4557,109 +4557,7 @@
                 <w:color w:val="000000"/>
                 <w:sz w:val="18"/>
               </w:rPr>
-              <w:t>0.5617</w:t>
-            </w:r>
-          </w:p>
-        </w:tc>
-        <w:tc>
-          <w:tcPr>
-            <w:tcW w:type="dxa" w:w="1728"/>
-          </w:tcPr>
-          <w:p>
-            <w:pPr>
-              <w:jc w:val="center"/>
-            </w:pPr>
-            <w:r>
-              <w:rPr>
-                <w:rFonts w:ascii="Calibri" w:hAnsi="Calibri"/>
-                <w:b w:val="0"/>
-                <w:i w:val="0"/>
-                <w:color w:val="000000"/>
-                <w:sz w:val="18"/>
-              </w:rPr>
-              <w:t>0.000 (***)</w:t>
-            </w:r>
-          </w:p>
-        </w:tc>
-      </w:tr>
-      <w:tr>
-        <w:tc>
-          <w:tcPr>
-            <w:tcW w:type="dxa" w:w="1728"/>
-          </w:tcPr>
-          <w:p>
-            <w:pPr>
-              <w:jc w:val="left"/>
-            </w:pPr>
-            <w:r>
-              <w:rPr>
-                <w:rFonts w:ascii="Calibri" w:hAnsi="Calibri"/>
-                <w:b/>
-                <w:i w:val="0"/>
-                <w:color w:val="000000"/>
-                <w:sz w:val="18"/>
-              </w:rPr>
-              <w:t>ENVIndex</w:t>
-            </w:r>
-          </w:p>
-        </w:tc>
-        <w:tc>
-          <w:tcPr>
-            <w:tcW w:type="dxa" w:w="1728"/>
-          </w:tcPr>
-          <w:p>
-            <w:pPr>
-              <w:jc w:val="right"/>
-            </w:pPr>
-            <w:r>
-              <w:rPr>
-                <w:rFonts w:ascii="Calibri" w:hAnsi="Calibri"/>
-                <w:b w:val="0"/>
-                <w:i w:val="0"/>
-                <w:color w:val="000000"/>
-                <w:sz w:val="18"/>
-              </w:rPr>
-              <w:t>0.0026</w:t>
-            </w:r>
-          </w:p>
-        </w:tc>
-        <w:tc>
-          <w:tcPr>
-            <w:tcW w:type="dxa" w:w="1728"/>
-          </w:tcPr>
-          <w:p>
-            <w:pPr>
-              <w:jc w:val="center"/>
-            </w:pPr>
-            <w:r>
-              <w:rPr>
-                <w:rFonts w:ascii="Calibri" w:hAnsi="Calibri"/>
-                <w:b w:val="0"/>
-                <w:i w:val="0"/>
-                <w:color w:val="000000"/>
-                <w:sz w:val="18"/>
-              </w:rPr>
-              <w:t>0.285 (n.s.)</w:t>
-            </w:r>
-          </w:p>
-        </w:tc>
-        <w:tc>
-          <w:tcPr>
-            <w:tcW w:type="dxa" w:w="1728"/>
-          </w:tcPr>
-          <w:p>
-            <w:pPr>
-              <w:jc w:val="right"/>
-            </w:pPr>
-            <w:r>
-              <w:rPr>
-                <w:rFonts w:ascii="Calibri" w:hAnsi="Calibri"/>
-                <w:b w:val="0"/>
-                <w:i w:val="0"/>
-                <w:color w:val="000000"/>
-                <w:sz w:val="18"/>
-              </w:rPr>
-              <w:t>-0.1215</w:t>
+              <w:t>0.6403</w:t>
             </w:r>
           </w:p>
         </w:tc>
@@ -4721,7 +4619,7 @@
                 <w:color w:val="000000"/>
                 <w:sz w:val="18"/>
               </w:rPr>
-              <w:t>0.0020</w:t>
+              <w:t>0.0229</w:t>
             </w:r>
           </w:p>
         </w:tc>
@@ -4741,7 +4639,7 @@
                 <w:color w:val="000000"/>
                 <w:sz w:val="18"/>
               </w:rPr>
-              <w:t>0.510 (n.s.)</w:t>
+              <w:t>0.082 (*)</w:t>
             </w:r>
           </w:p>
         </w:tc>
@@ -4761,7 +4659,7 @@
                 <w:color w:val="000000"/>
                 <w:sz w:val="18"/>
               </w:rPr>
-              <w:t>0.0621</w:t>
+              <w:t>-0.1643</w:t>
             </w:r>
           </w:p>
         </w:tc>
@@ -4781,109 +4679,7 @@
                 <w:color w:val="000000"/>
                 <w:sz w:val="18"/>
               </w:rPr>
-              <w:t>0.000 (***)</w:t>
-            </w:r>
-          </w:p>
-        </w:tc>
-      </w:tr>
-      <w:tr>
-        <w:tc>
-          <w:tcPr>
-            <w:tcW w:type="dxa" w:w="1728"/>
-          </w:tcPr>
-          <w:p>
-            <w:pPr>
-              <w:jc w:val="left"/>
-            </w:pPr>
-            <w:r>
-              <w:rPr>
-                <w:rFonts w:ascii="Calibri" w:hAnsi="Calibri"/>
-                <w:b/>
-                <w:i w:val="0"/>
-                <w:color w:val="000000"/>
-                <w:sz w:val="18"/>
-              </w:rPr>
-              <w:t>GOVIndex</w:t>
-            </w:r>
-          </w:p>
-        </w:tc>
-        <w:tc>
-          <w:tcPr>
-            <w:tcW w:type="dxa" w:w="1728"/>
-          </w:tcPr>
-          <w:p>
-            <w:pPr>
-              <w:jc w:val="right"/>
-            </w:pPr>
-            <w:r>
-              <w:rPr>
-                <w:rFonts w:ascii="Calibri" w:hAnsi="Calibri"/>
-                <w:b w:val="0"/>
-                <w:i w:val="0"/>
-                <w:color w:val="000000"/>
-                <w:sz w:val="18"/>
-              </w:rPr>
-              <w:t>0.0066</w:t>
-            </w:r>
-          </w:p>
-        </w:tc>
-        <w:tc>
-          <w:tcPr>
-            <w:tcW w:type="dxa" w:w="1728"/>
-          </w:tcPr>
-          <w:p>
-            <w:pPr>
-              <w:jc w:val="center"/>
-            </w:pPr>
-            <w:r>
-              <w:rPr>
-                <w:rFonts w:ascii="Calibri" w:hAnsi="Calibri"/>
-                <w:b w:val="0"/>
-                <w:i w:val="0"/>
-                <w:color w:val="000000"/>
-                <w:sz w:val="18"/>
-              </w:rPr>
-              <w:t>0.075 (*)</w:t>
-            </w:r>
-          </w:p>
-        </w:tc>
-        <w:tc>
-          <w:tcPr>
-            <w:tcW w:type="dxa" w:w="1728"/>
-          </w:tcPr>
-          <w:p>
-            <w:pPr>
-              <w:jc w:val="right"/>
-            </w:pPr>
-            <w:r>
-              <w:rPr>
-                <w:rFonts w:ascii="Calibri" w:hAnsi="Calibri"/>
-                <w:b w:val="0"/>
-                <w:i w:val="0"/>
-                <w:color w:val="000000"/>
-                <w:sz w:val="18"/>
-              </w:rPr>
-              <w:t>0.0032</w:t>
-            </w:r>
-          </w:p>
-        </w:tc>
-        <w:tc>
-          <w:tcPr>
-            <w:tcW w:type="dxa" w:w="1728"/>
-          </w:tcPr>
-          <w:p>
-            <w:pPr>
-              <w:jc w:val="center"/>
-            </w:pPr>
-            <w:r>
-              <w:rPr>
-                <w:rFonts w:ascii="Calibri" w:hAnsi="Calibri"/>
-                <w:b w:val="0"/>
-                <w:i w:val="0"/>
-                <w:color w:val="000000"/>
-                <w:sz w:val="18"/>
-              </w:rPr>
-              <w:t>0.842 (n.s.)</w:t>
+              <w:t>0.023 (**)</w:t>
             </w:r>
           </w:p>
         </w:tc>
@@ -4925,7 +4721,7 @@
                 <w:color w:val="000000"/>
                 <w:sz w:val="18"/>
               </w:rPr>
-              <w:t>-0.1304</w:t>
+              <w:t>-0.5709</w:t>
             </w:r>
           </w:p>
         </w:tc>
@@ -4945,7 +4741,7 @@
                 <w:color w:val="000000"/>
                 <w:sz w:val="18"/>
               </w:rPr>
-              <w:t>0.116 (n.s.)</w:t>
+              <w:t>0.050 (*)</w:t>
             </w:r>
           </w:p>
         </w:tc>
@@ -4965,7 +4761,7 @@
                 <w:color w:val="000000"/>
                 <w:sz w:val="18"/>
               </w:rPr>
-              <w:t>0.9873</w:t>
+              <w:t>6.9062</w:t>
             </w:r>
           </w:p>
         </w:tc>
@@ -4985,7 +4781,7 @@
                 <w:color w:val="000000"/>
                 <w:sz w:val="18"/>
               </w:rPr>
-              <w:t>0.093 (*)</w:t>
+              <w:t>0.045 (**)</w:t>
             </w:r>
           </w:p>
         </w:tc>
@@ -5027,7 +4823,7 @@
                 <w:color w:val="000000"/>
                 <w:sz w:val="18"/>
               </w:rPr>
-              <w:t>0.0594</w:t>
+              <w:t>0.0790</w:t>
             </w:r>
           </w:p>
         </w:tc>
@@ -5047,7 +4843,7 @@
                 <w:color w:val="000000"/>
                 <w:sz w:val="18"/>
               </w:rPr>
-              <w:t>0.000 (***)</w:t>
+              <w:t>0.069 (*)</w:t>
             </w:r>
           </w:p>
         </w:tc>
@@ -5067,7 +4863,7 @@
                 <w:color w:val="000000"/>
                 <w:sz w:val="18"/>
               </w:rPr>
-              <w:t>0.0237</w:t>
+              <w:t>-0.0436</w:t>
             </w:r>
           </w:p>
         </w:tc>
@@ -5087,7 +4883,7 @@
                 <w:color w:val="000000"/>
                 <w:sz w:val="18"/>
               </w:rPr>
-              <w:t>0.099 (*)</w:t>
+              <w:t>0.604 (n.s.)</w:t>
             </w:r>
           </w:p>
         </w:tc>
@@ -5129,7 +4925,7 @@
                 <w:color w:val="000000"/>
                 <w:sz w:val="18"/>
               </w:rPr>
-              <w:t>-0.0037</w:t>
+              <w:t>-0.0882</w:t>
             </w:r>
           </w:p>
         </w:tc>
@@ -5149,7 +4945,7 @@
                 <w:color w:val="000000"/>
                 <w:sz w:val="18"/>
               </w:rPr>
-              <w:t>0.084 (*)</w:t>
+              <w:t>0.258 (n.s.)</w:t>
             </w:r>
           </w:p>
         </w:tc>
@@ -5169,7 +4965,7 @@
                 <w:color w:val="000000"/>
                 <w:sz w:val="18"/>
               </w:rPr>
-              <w:t>0.0021</w:t>
+              <w:t>-0.1664</w:t>
             </w:r>
           </w:p>
         </w:tc>
@@ -5189,7 +4985,7 @@
                 <w:color w:val="000000"/>
                 <w:sz w:val="18"/>
               </w:rPr>
-              <w:t>0.600 (n.s.)</w:t>
+              <w:t>0.000 (***)</w:t>
             </w:r>
           </w:p>
         </w:tc>
@@ -5202,7 +4998,7 @@
     </w:p>
     <w:p>
       <w:r>
-        <w:t>Sabit Etkiler modeli bulguları, bir önceki dönemin CO2 emisyonunun (L1_CO2) emisyon tutarlılığı üzerinde yüksek düzeyde anlamlı ve pozitif bir etkiye sahip olduğunu ortaya koymaktadır. Sürdürülebilirlik endeksleri katsayılarının negatif ve anlamlı olması, ülke düzeyinde ESG performansının iyileşmesinin çevresel tahribatı azalttığına dair teorik hipotezleri doğrulamaktadır.</w:t>
+        <w:t>Sabit Etkiler modeli bulguları, geçmiş dönem greenwashing durumunun (Lag Greenwashing) mevcut dönem sapması üzerinde yüksek düzeyde anlamlı ve pozitif bir etkiye sahip olduğunu ortaya koyarak kurumsal davranışsal ataleti doğrulamaktadır. Sosyal kalkınmışlık katsayısının (SOCIndex) negatif ve anlamlı olması, toplumsal refah ve cinsiyet eşitliği alanındaki reformların söylem-eylem ayrışmasını engelleyici yönde çalıştığını kanıtlamaktadır.</w:t>
       </w:r>
     </w:p>
     <w:sectPr>

</xml_diff>